<commit_message>
Align Nur and Rana interviews with Nur's original transcript in the seminar paper
Co-Authored-By: Claude Fable 5.1 <noreply@anthropic.com>
Claude-Session: https://claude.ai/code/session_011Z9C2ptByc9jQga6MDruQz
</commit_message>
<xml_diff>
--- a/deliverables/ראיונות_5_נשים_יזמות.docx
+++ b/deliverables/ראיונות_5_נשים_יזמות.docx
@@ -74,7 +74,7 @@
           <w:szCs w:val="24"/>
           <w:rtl/>
         </w:rPr>
-        <w:t xml:space="preserve">בת 54, נשואה ואם לארבעה, ללא השכלה אקדמית. בשנת 2002, בגיל 30, פתחה חנות בגדים יחד עם אחותה רנא, והחנות פועלת עד היום.</w:t>
+        <w:t xml:space="preserve">בת 54, נשואה ואם לילדים, ללא השכלה אקדמית. בחודש מרץ 2002, בגיל 30, פתחה חנות בגדים לנשים ולבנות יחד עם אחותה רנא, והחנות פועלת עד היום.</w:t>
       </w:r>
     </w:p>
     <w:p>
@@ -93,7 +93,7 @@
           <w:szCs w:val="24"/>
           <w:rtl/>
         </w:rPr>
-        <w:t xml:space="preserve">הריאיון נערך בחנות, בשעות הבוקר לפני פתיחה, משך ההקלטה 46 דקות.</w:t>
+        <w:t xml:space="preserve">הריאיון נערך בחנות, בשעות הבוקר לפני הפתיחה, משך ההקלטה 46 דקות.</w:t>
       </w:r>
     </w:p>
     <w:p>
@@ -129,7 +129,7 @@
           <w:szCs w:val="24"/>
           <w:rtl/>
         </w:rPr>
-        <w:t xml:space="preserve">נולדתי בעיר, במשפחה של שבעה ילדים, אני הרביעית. אבא שלי עבד בבניין ואמא בבית, וגדלנו בבית קטן שבו לא היה מחסור באוכל אבל היה מחסור בכל השאר: בגדים חדשים קיבלנו פעם בשנה, לחג, ונעליים עברו מאחות לאחות. סיימתי שתים עשרה שנות לימוד, לא ניגשתי לכל הבגרויות, כי בבית לא חשבו שבת צריכה, והתחתנתי בגיל תשע עשרה. בעלי עבד כנהג משאית, שכר בינוני, ועד גיל שלושים הייתי בבית עם ארבעה ילדים. המצב הכלכלי היה כזה שבסוף כל חודש היינו סופרים: שכר דירה, חשמל, אוכל, ומה שנשאר הלך לילדים. לא היו חובות גדולים, אבל גם לא היה אוויר. כשאחד הילדים היה צריך משהו מיוחד, משקפיים, טיול, הייתי צריכה לבקש מאמא שלי או מאח שלי, וזה היה הרגע שהכי שנאתי: לא העוני עצמו, אלא לבקש. אני זוכרת שהייתי יושבת בלילה עם הפנקס ומחשבת, ומחליטה שאין לי איך לעזור, ואז הולכת לישון עם זה.</w:t>
+        <w:t xml:space="preserve">אני בת חמישים וארבע, נשואה, ויש לי ילדים שכבר גדולים. גדלתי במשפחה רגילה, לא עשירה ולא ענייה, ואני גרה גם היום ליד בית ההורים שלי, כי אחרי הנישואים נשארנו קרוב. סיימתי בית ספר ולא המשכתי ללמוד, ולא בגלל שמישהו במשפחה אמר לי לא. בזמננו הדברים היו שונים. לא היו האפשרויות שיש היום. פעם מסיימים בית ספר וזהו, לא היה כמו היום שכל בת ממשיכה. התחתנתי צעירה, והייתי בבית עם הילדים. לפני שפתחתי את החנות המצב שלנו היה קשה מאוד. לא היה לנו מקור הכנסה קבוע. בעלי עבד, אבל באותה תקופה העבודה לא הייתה כמו היום: היו שבועות שהיה עבודה ושבועות שלא, ואף פעם לא ידענו מה יהיה בסוף החודש. אני זוכרת שהייתי מחכה שיגיע יום שבו הוא חוזר עם כסף, ומחלקת אותו בראש עוד לפני שהוא נכנס הביתה: זה לאוכל, זה לילדים, וזה למה שנשאר, ובדרך כלל לא נשאר. ברוך השם, עם הזמן המצב השתפר, אבל אז, עד גיל שלושים, ככה חיינו.</w:t>
       </w:r>
     </w:p>
     <w:p>
@@ -165,7 +165,7 @@
           <w:szCs w:val="24"/>
           <w:rtl/>
         </w:rPr>
-        <w:t xml:space="preserve">מה שגרם לי לצאת לעבודה היה שילוב של צורך וסיבה. הצורך: בעלי נפצע בתאונת עבודה בשנת 2001 ולא יכול היה לנהוג חצי שנה, ופתאום לא היה שכר. הסיבה: אחותי רנא, שגרה בעיר אחרת, כבר עבדה בחנות של גיסה שלה, והיא זו שאמרה לי "תפסיקי לחכות שמישהו יציל אותך". לא חשבתי על עסק. חשבתי על עבודה כעוזרת במכולת, משהו קטן. אבל רנא באה עם רעיון: בעיר שלנו לא הייתה חנות בגדים לנשים שמתאימה לנשים כמונו, במחירים כמונו, עם מישהי שמדברת בשפה שלנו ומבינה מה מותר ומה לא. כל הבגדים קנו בעיר אחרת, או משווקים שבאו הביתה. ישבנו שתינו במטבח שלי, עם ילד על הברכיים, וחישבנו. היא הביאה מה שחסכה, אני לקחתי הלוואה קטנה מאח שלי, ושכרנו חנות של שלושים מטר ברחוב הראשי, ליד המאפייה. פתחנו באפריל 2002, עם ארבעה מתלים ומראה אחת. לא הייתה לי שום הכנה. היה לי פחד, והיה לי מחשב בראש של כמה אנחנו צריכות למכור ביום כדי לשלם את שכר הדירה.</w:t>
+        <w:t xml:space="preserve">לא חשבתי על קריירה ולא על עסק. חשבתי שצריך להכניס כסף הביתה, זה הכול. ההכנסה של בעלי לא הספיקה, ואני ישבתי בבית והרגשתי שאני לא עוזרת. אחותי רנא, שהיא גדולה ממני בשנה, הייתה יותר מנוסה ממני בתחום הבגדים, היא כבר עבדה בזה אצל קרובים, והיא הבינה מה נשים אצלנו מחפשות ומה לא. דיברנו, ואמרנו: בואי ננסה. בחרנו בגדים שמתאימים לבנות ולנשים שהגיעו אלינו, לא דברים מיוחדים, דברים שאישה אצלנו צריכה לחג, לחתונה, ליום יום. התחלנו אני ואחותי לבד. לא היה לנו הרבה, אבל התחלנו ועבדנו. לא ביקשנו עצות מאף אחד, לא היה ממי. לא היה הון, לא הייתה תוכנית, היה חדר קטן קרוב לבית ושתי אחיות שרצו לעבוד. פתחתי בשנת 2002 בחודש מרץ, כשהייתי בת שלושים ורנא בת שלושים ואחת, ואני לא אשכח את היום הזה. אהבתי את תחום המסחר מהיום הראשון והרגשתי שהוא מתאים לי, ואם לא היה בגדים, הייתי עושה כל דבר אחר שקשור למסחר.</w:t>
       </w:r>
     </w:p>
     <w:p>
@@ -201,7 +201,7 @@
           <w:szCs w:val="24"/>
           <w:rtl/>
         </w:rPr>
-        <w:t xml:space="preserve">למדתי מהטעויות, ומרנא, ומהלקוחות. רנא ידעה את הצד של המכירה, איך לדבר עם אישה שמודדת, מתי לשתוק, מתי להגיד "זה לא מתאים לך" כדי שהיא תאמין לך בפעם הבאה. אני למדתי את הצד של הכסף: לרשום כל שקל, לדעת מה נמכר ומה יושב, לא לקנות מה שאני אוהבת אלא מה שהן קונות. את זה למדתי בפנקס, בלי מחשב, ועד היום יש לי פנקסים מכל השנים. עזר לי גם סוחר יהודי מהשוק בתל אביב, ממנו קנינו סחורה, שראה שאני לא יודעת כלום ולימד אותי לבדוק בד, לשאול על תנאי תשלום, ולא לקנות הכול מספק אחד. הטעות שאני הכי זוכרת היא מהשנה הראשונה: קניתי לפני החורף מעילים יקרים, כי חשבתי שהנשים אצלנו ירצו משהו יפה. החורף היה חם, המעילים ישבו, והכסף של שני חודשים נתקע על המתלים. מכרנו אותם בקיץ שאחרי בחצי מחיר. מאז אני לא קונה לפי מה שאני רוצה למכור אלא לפי מה שנמכר, ואני קונה מעט ומוסיפה, לא קונה הרבה ומתפללת. ולמדתי שהלקוחה שמחזירה היא השיעור הכי טוב: אם שלוש נשים מחזירות אותו דבר, הבעיה לא בהן.</w:t>
+        <w:t xml:space="preserve">למדתי בעיקר מהניסיון ומהדברים שעברתי במהלך העבודה. בשנה הראשונה היה לי קשה מאוד, במיוחד בחישובים. לא היה לי ניסיון קודם בדברים האלה: כמה עולה, כמה מוכרים, מה נשאר אחרי שמשלמים לספק ולחנות. בעלה של אחותי עזר לנו קצת, הוא היה יושב איתנו בערב ומסדר את המספרים, ועם הזמן, אחרי שנכנסנו יותר לתוך העבודה וצברנו ניסיון, זה הפך להיות רגיל וקל יותר. טעויות היו הרבה. למשל, לפעמים עושים טעות בחישוב, או קונים סחורה ואחר כך מגלים שהיא לא נמכרת כמו שציפינו, ואז הכסף יושב על המדף. היום אפשר לפרסם דברים באינסטגרם וברשתות, אבל בזמננו הדברים האלה לא היו קיימים, אז הכול למדנו מהלקוחות עצמן: מה הן לוקחות ומה הן מחזירות. גם העברית הייתה קושי. כשהייתי צעירה כמעט לא ידעתי עברית, וכשצריך לדבר עם ספקים בתל אביב זה היה קשה מאוד, אבל עם הזמן למדתי להסתדר. ולמדתי את הדבר הכי חשוב בעבודה הזאת: חשוב לדעת לדבר עם אנשים ולהתייחס אליהם בצורה טובה. אם את לא יודעת לדבר ולהתנהל עם אנשים, הם לא ירצו להיכנס אלייך.</w:t>
       </w:r>
     </w:p>
     <w:p>
@@ -237,7 +237,7 @@
           <w:szCs w:val="24"/>
           <w:rtl/>
         </w:rPr>
-        <w:t xml:space="preserve">בעלי, בהתחלה, שתק. הוא היה פצוע, לא עבד, ואני חושבת שהוא הרגיש שהעובדה שאני פותחת חנות אומרת משהו עליו. הוא לא אמר "לא", אבל הוא גם לא אמר "כן", ובחודשים הראשונים הוא לא בא לחנות אפילו פעם אחת. אמא שלי פחדה: "מה יגידו, אישה בחנות כל היום, מי ישמור על הילדים". אבא שלי כבר לא היה בחיים, ואני חושבת שהוא היה מתנגד. אחים שלי התחלקו: האח שנתן לי את ההלוואה תמך, אח אחר אמר שאני "מביישת" את בעלי. מה ששינה את זה היה הכסף, בכנות. אחרי חצי שנה הבאתי הביתה יותר ממה שבעלי הביא לפני התאונה, ואז השתיקה שלו הפכה לעזרה: הוא התחיל להביא סחורה במשאית, לתקן מדפים, לשבת בחנות כשרנא ואני נסענו לקנות. היום, עשרים וארבע שנים אחרי, הוא אומר לאנשים "החנות של אשתי" בגאווה, ואני לא שוכחת שבהתחלה הוא לא אמר כלום. הילדים גדלו בחנות, בין המתלים, עם שיעורי בית על הדלפק, ואני חושבת שהם גדלו טוב דווקא בגלל זה.</w:t>
+        <w:t xml:space="preserve">המשפחה תמכה בי. כולם תמכו בי ובאחותי ועמדו לצידנו, ההורים, האחים, כולם. זה שאני גרה ליד בית ההורים עזר מאוד, כי החנות הייתה קרובה לבית, ומבחינת המרחק לא הייתה בעיה גדולה, לא הייתי צריכה נסיעות ולא מישהו שישמור על הילדים רחוק. עם בעלי זה היה יותר מורכב. הוא לא התנגד לחנות עצמה, אבל הייתה תקופה שבה היה לבעלי קשה עם זה, במיוחד בתקופות שבהן הייתי הרבה בעסק. נוצרו בינינו לפעמים בעיות, כי הוא הרגיש שאני מתעניינת בחנות יותר מאשר בבית ובו. היו ערבים של שתיקה. אבל בהמשך, ברוך השם, הוא הבין אותי. הוא ראה שהחנות לא לוקחת אותי מהמשפחה אלא עוזרת למשפחה. ומאז הוא תמך בי ועד היום הוא תומך בי. כשהיינו צריכות סחורה מתל אביב, אחותי ובעלי היו נוסעים ועוזרים לי, הוא היה לוקח את האוטו, מחכה להן בשוק, סוחב את השקיות. בעלי עזר לנו הרבה, שאלוהים ישמור עליו. הוא האמין בי. אם הוא לא היה מאמין בי, לא היינו ממשיכים יחד עד היום.</w:t>
       </w:r>
     </w:p>
     <w:p>
@@ -273,7 +273,7 @@
           <w:szCs w:val="24"/>
           <w:rtl/>
         </w:rPr>
-        <w:t xml:space="preserve">ביקורת שמעתי הרבה, ובעיקר בשנים הראשונות, ובעיקר מנשים. "היא עוזבת את הילדים", "היא יושבת ברחוב כל היום", "בעלה לא גבר". גם מהמשפחה המורחבת של בעלי, דודה שלו אמרה בחתונה, בקול, שאישה שמוכרת בגדים "מתחילה בזה ונגמר במשהו אחר". אני זוכרת את המשפט הזה מילה במילה. הביקורת מגברים הייתה פחות, כי גברים אצלנו לא מדברים על נשים, הם מדברים על הבעל, וזה היה כואב יותר, כי זה פגע בו ולא בי. מה שהיה הכי קשה בדרך זה לא הביקורת, זה העייפות. לקום בחמש, להכין את הילדים, לפתוח את החנות בתשע, לסגור בשבע, לחזור, לבשל, לרשום בפנקס, לישון בשתים עשרה. ככה חמש שנים, בלי יום חופש, כי כל יום סגור היה יום בלי מכירות. היו לילות שבכיתי במטבח, לא בגלל שמישהו אמר משהו, אלא בגלל שלא היה לי כוח להעמיד פנים שיש לי כוח. ורנא, שהייתה במצב דומה, הייתה מתקשרת בלילה, ואנחנו היינו צוחקות על זה. בלי הצחוק הזה לא הייתי מחזיקה.</w:t>
+        <w:t xml:space="preserve">בהתחלה כן, היו אנשים שדיברו והעבירו ביקורת. ביישוב קטן כל דבר נשמע. אני זוכרת מקרה שבו לקוחה ביקשה מידה מסוימת ולא הייתה המידה שהיא רצתה. כנראה שזה לא מצא חן בעיניה, ואחר כך הגיע אליי שהיא דיברה עליי, שאין אצלנו כלום, שלא שווה לבוא. שמעתי שהיא דיברה, אבל לא התייחסתי לזה. המשכתי, כמובן. למדתי שמי שמתייחסת לכל מילה לא יכולה לעמוד בחנות. אבל הכי קשה בדרך לא היה הדיבורים. בעסק יש הרבה דברים קשים שאדם עובר. למשל, בתקופות שאין חגים או אירועים, לפעמים אין מספיק עבודה. את עומדת בחנות ויש לך במקביל בית, הוצאות וילדים, ואז מרגישים את הקושי. בהתחלה עברנו הרבה קשיים, היו חודשים שההפסד היה גדול מהרווח, ושכר החנות צריך לשלם בכל מקרה. וקשה היה השילוב: לקום מוקדם, לסדר את הילדים, לעמוד בחנות כל היום, לחזור ולבשל. גבר יכול לעבוד בלילה, אישה פחות, אישה צריכה להיות גם בבית. זה היה הקושי האמיתי, לא הביקורת.</w:t>
       </w:r>
     </w:p>
     <w:p>
@@ -309,7 +309,7 @@
           <w:szCs w:val="24"/>
           <w:rtl/>
         </w:rPr>
-        <w:t xml:space="preserve">הכוח בא משלושה מקומות. הראשון, רנא: שתי אחיות שעובדות יחד זה או קטסטרופה או ברכה, ואצלנו זו ברכה, כי כשאחת נופלת השנייה מחזיקה. השני, הלקוחות: אחרי כמה שנים נשים התחילו לבוא לחנות לא רק לקנות, אלא לדבר, לשאול עצה, להביא את הבת לפני החתונה. הבנתי שהחנות היא יותר מחנות, שהיא מקום שנשים מרגישות בו בבית, וזה נתן משמעות לעייפות. השלישי, הילדים: כשהבת הגדולה שלי נרשמה לאוניברסיטה, ושילמתי את שכר הלימוד מהחנות, בלי לבקש מאף אחד, ישבתי באוטו ובכיתי. מה שהשתנה בי: הפסקתי לפחד מאנשים. לפני החנות הייתי אישה שמחכה שיגידו לה מה לעשות, ובחנות למדתי להגיד לא לספק, להתווכח על מחיר, לדרוש מהעירייה, לדבר עם בנקאי. למדתי שיש לי ראש, ושהראש הזה שווה כסף. ומשהו אחר השתנה: הפסקתי לבקש. הדבר שהכי שנאתי בחיים הראשונים שלי, לבקש, נעלם. היום מבקשים ממני.</w:t>
+        <w:t xml:space="preserve">צריך סבלנות. בתקופות הקשות, כשלא הייתה עבודה וההוצאות המשיכו, אדם אומר לעצמו שהוא צריך לחכות ולתת לדבר לגדול. חייב להיות רצון מבפנים. כשאת מחליטה שאת רוצה לעשות משהו, את ממשיכה, גם כשאין לקוחות שבוע שלם. נתנה לי כוח גם אחותי, כי לא הייתי לבד, וכשאחת מאיתנו התייאשה השנייה אמרה עוד חודש. ונתנה לי כוח האמונה, שאלוהים לא ישאיר אותנו. מה שהשתנה בי הכי הרבה זה האופי. בעבר לא הייתי יכולה לסבול אפילו מילה. אם לקוחה אמרה משהו, אם בעלי אמר משהו, הייתי מתפוצצת. היום אני הרבה יותר סבלנית. למדתי להיות סבלנית ולדעת איך להתנהל עם אנשים, איך לשמוע לקוחה שכועסת ולא לכעוס בחזרה. היום אני רגועה יותר, בחנות ובבית. הדבר הכי חשוב שלמדתי הוא סבלנות. ואני רואה את עצמי כאישה חזקה מאוד, ברוך השם. עברתי והתמודדתי עם דברים שלא היו קלים, והצלחתי להתגבר עליהם בעזרת הסבלנות, הרצון והכוח, וכמובן בעזרת אלוהים.</w:t>
       </w:r>
     </w:p>
     <w:p>
@@ -345,7 +345,7 @@
           <w:szCs w:val="24"/>
           <w:rtl/>
         </w:rPr>
-        <w:t xml:space="preserve">הצלחה בשבילי היא לא החנות. החנות היא הכלי. הצלחה בשבילי היא שבבית שלי אף ילד לא הצטרך לבקש ממישהו, ושארבעת הילדים שלי למדו, שלוש בנות באוניברסיטה ובן אחד שלמד מקצוע, ושאף אחד מהם לא פחד לבחור מה שהוא רוצה. הצלחה היא גם הרגע שבו אישה נכנסת לחנות, בת שישים, ואומרת לי "אני רוצה לפתוח משהו משלי, איך עשית את זה", ואני יושבת איתה שעה. בשנים האחרונות שלוש נשים מהעיר פתחו עסקים אחרי שישבו איתי, ואני חושבת שזה שווה יותר מהרווח של עשר שנים. והצלחה היא שהחנות עדיין פה, עשרים וארבע שנים, אחרי שחנויות גדולות נפתחו ונסגרו סביבנו, כי הנשים יודעות שאצלנו מישהי מכירה אותן. אני לא מודדת הצלחה בכסף, כי הכסף בא והולך, והיו שנים קשות, הקורונה כמעט סגרה אותנו. אני מודדת אותה בזה שאני יכולה להסתכל על עצמי במראה של החנות, אותה מראה מ-2002, ולראות אישה שעומדת על הרגליים שלה.</w:t>
+        <w:t xml:space="preserve">הצלחה בשבילי היא רצון. צריך שיהיה לך רצון כדי להצליח. לא משנה מה קורה, אל תקשיבי לכל אחד. את צריכה להיות משוכנעת במה שאת עושה ולאהוב את מה שאת עושה כדי להצליח. אני לא מודדת הצלחה בכסף, כי היו שנים עם כסף ושנים בלי, והחנות נשארה. הצלחה בשבילי היא שהחנות פתוחה עשרים וארבע שנים, שהילדים גדלו ולא חסר להם, ושאני יודעת שעשיתי את זה בידיים שלי, יחד עם אחותי. אבל אני לא מרגישה שהגעתי לסוף. לא תמיד בן אדם מגיע למאה אחוז. אני רוצה להגיע ליותר, כמובן. בן אדם לא תמיד מסתפק במה שיש לו, זאת הטבע שלנו. הייתי רוצה להתפתח ולפתוח עוד חנויות, למשל ביישובים מסביב, סניפים נוספים, אולי עם הבנות. וכשאני רואה נשים אחרות, אני יודעת שאפשר. יש הרבה נשים שהצליחו בלי השכלה אקדמית. גם אצלנו יש נשים שפתחו עסקים ופרויקטים שונים והצליחו, ואף אחת מהן לא למדה את זה בשום מקום.</w:t>
       </w:r>
     </w:p>
     <w:p>
@@ -381,7 +381,7 @@
           <w:szCs w:val="24"/>
           <w:rtl/>
         </w:rPr>
-        <w:t xml:space="preserve">השתנה הרבה, ולא הכול. כשאני פתחתי, אישה בחנות הייתה דבר שמדברים עליו. היום בעיר שלנו יש עשרות נשים עם עסקים: קוסמטיקה, אפייה, בגדים, גני ילדים, ואף אחד לא מסתכל פעמיים. הבנות שלי לא מבינות בכלל על מה הייתה הבעיה. נשים צעירות היום לומדות, נוהגות, פותחות דף באינסטגרם ומוכרות מהבית, ויש להן משהו שלי לא היה: הן יודעות שמותר. מה שלא השתנה: הציפייה שהאישה תעשה הכול. אני רואה את הצעירות שעובדות ולומדות ומגדלות ילדים ומנהלות בית, והבעלים "עוזרים", כמו שבעלי "עזר" לי. זה לא שוויון, זה עומס כפול שקוראים לו התקדמות. ולא השתנה גם הפחד מהדיבור: גם היום אישה שנכשלת בעסק שומעת "אמרנו לך", ואישה שמצליחה שומעת "מי יודע איך". מה שכן השתנה באמת הוא שיש היום נשים שאפשר ללמוד מהן. אני לא הייתה לי אף אחת. לבנות שלי יש אותי, ויש להן עוד עשר. זה ההבדל הגדול.</w:t>
+        <w:t xml:space="preserve">זה היה יותר בעבר. היום אנחנו בתקופה אחרת, ואפילו בהשוואה ללפני שלושים או ארבעים שנה הדברים השתנו. החברה השתנתה מאוד. בעבר היה הרבה יותר קשה לאישה להצליח, כי היו דברים שהיא לא הייתה יכולה לעשות כמו גבר. גבר יכול לעבוד בלילה, לנסוע לבד, לפתוח עסק ואף אחד לא שואל. אישה פחות. כשאני פתחתי, אישה שעומדת בחנות כל היום הייתה משהו שמדברים עליו. היום הנשים מצליחות יותר ויותר, ובכל רחוב אצלנו יש אישה עם עסק. אישה שמכבדת את עצמה לא צריכה לפחד לדבר או להתנהל עם אנשים, וזה מה שהבנות של היום כבר יודעות. מה שעוד השתנה זה הלימודים. בזמננו סיימו בית ספר וזהו, והיום הדברים שונים מאוד, ויש יותר חשיבות לתעודה ולהשכלה. הבנות היום לומדות, ובצדק, כי העולם שאני פתחתי בו, בלי רשתות ובלי תעודות, כבר לא קיים. אבל אני חושבת שגם היום, עם כל השינוי, אישה שרוצה צריכה את אותו הדבר שאני הייתי צריכה: רצון, סבלנות, ומשפחה שעומדת לידה.</w:t>
       </w:r>
     </w:p>
     <w:p>
@@ -417,7 +417,7 @@
           <w:szCs w:val="24"/>
           <w:rtl/>
         </w:rPr>
-        <w:t xml:space="preserve">הייתי אומרת לה שלושה דברים. הראשון: תלמדי, גם אם את לא צריכה תעודה, תלמדי משהו, כי כל מה שאני עשיתי בלי לימודים הייתי עושה פי שניים מהר עם לימודים. השני: תתחילי קטן ותרשמי כל שקל. רוב הנשים שאני רואה נופלות לא בגלל שהרעיון רע, אלא בגלל שהן לא יודעות כמה הן מרוויחות באמת, וכשמגלים, מאוחר. השלישי, והכי חשוב: אל תחכי שמישהו ייתן לך רשות. אני חיכיתי עד גיל שלושים, ובדיעבד, אף אחד לא היה נותן לי רשות אף פעם, לקחתי אותה כי לא הייתה ברירה. אישה צעירה היום יכולה לקחת אותה לפני שאין ברירה. ואני מוסיפה עוד דבר, שאני אומרת לכל מי שיושבת איתי בחנות: תמצאי שותפה. לא בהכרח אחות, אבל מישהי. לבד זה אפשרי, אבל לבד זה קשה פי שלושה, ובלילות הקשים צריך מישהי שתצחק איתך.</w:t>
+        <w:t xml:space="preserve">הייתי אומרת לה שלא תחכה. שתתחיל לעבוד ולא תחכה לאף אחד, לא לבעל, לא להורים, לא לזמן המתאים, כי הזמן המתאים לא מגיע. שלא תיתן למילים של אחרים להוריד לה את המוטיבציה. תמיד יהיה מי שידבר, בהתחלה יותר, אחר כך פחות, וכשיש הצלחה הם שותקים. בהתחלה זה יכול להיות קשה, אבל אחר כך העסק יכול לגדול ולהצליח, בעזרת השם. והייתי אומרת לה שמי שרוצה להקים עסק צריכה להיות סבלנית, במיוחד במסחר. במסחר יש חודשים טובים וחודשים ריקים, וצריך לדעת לקבל הפסד כמו שמקבלים רווח. מי שלא יכולה לסבול הפסד, שלא תפתח. צריך סבלנות וכוח להמשיך. והייתי אומרת לה להיות חזקה. לא משנה מה קורה בחיים, היא לא צריכה להתייאש. גם אם היא נופלת בדרך, היא צריכה לקום ולהמשיך. ועוד דבר אחד, מהניסיון שלי: אם יש לה מישהי לעבוד איתה, אחות, חברה, שתיקח אותה. לבד זה אפשרי, אבל ביחד זה קל יותר, ובימים הקשים צריך מישהי שתגיד לך עוד חודש.</w:t>
       </w:r>
     </w:p>
     <w:p>
@@ -453,7 +453,7 @@
           <w:szCs w:val="24"/>
           <w:rtl/>
         </w:rPr>
-        <w:t xml:space="preserve">כן, אני מסכימה, ובשמחה. בשם בדוי, כן, כי אני לא רוצה שהבנות שלי יקראו את החלק על אבא שלהן בהתחלה, הן יודעות אבל לא צריכות לקרוא. ואני רוצה להגיד למה אני מסכימה: כשרנא ואני התחלנו, לא היה אף אחד שאפשר היה לקרוא מה הוא עבר, ואם הסיפור שלי יהיה בעבודה שמישהי צעירה תקרא, אולי זה יהיה בשבילה מה שהייתי צריכה בשנת 2002 ולא היה. תכתבי את הכול, גם את הקשה, גם את הבכי במטבח, כי אם תכתבי רק את ההצלחה, אף אחת לא תאמין, ואם תכתבי רק את הקושי, אף אחת לא תנסה. ואם מותר לי לבקש דבר אחד: אל תכתבי "אישה פשוטה". אני שומעת את זה הרבה על נשים כמוני. אני לא פשוטה, אני לא למדתי. זה לא אותו דבר. ואם תרצי לחזור עם שאלות אחרי שתכתבי, תבואי לחנות ביום חמישי אחר הצהריים, כשרנא פה, ותשמעי את אותו סיפור בגרסה שלה. הוא שונה, ושתינו צודקות.</w:t>
+        <w:t xml:space="preserve">כן, כמובן שאני מסכימה. אין לי בעיה שהדברים שלי יהיו בעבודה ויוצגו בפני המרצים, ובשם בדוי זה אפילו עדיף, כי אצלנו כולם מכירים את החנות ואני לא רוצה שיזהו לקוחה או שידברו על בעלי. אני מסכימה כי אני חושבת שהסיפור הזה יכול לעזור. כשאני ואחותי התחלנו לא היה לנו ממי ללמוד ולא היה ממי לשמוע איך זה עובד, הכול עשינו לבד, בטעויות. אם בת צעירה תקרא את זה ותבין שאפשר להתחיל בלי הרבה ולהצליח עם סבלנות, זה שווה. רק דבר אחד אני מבקשת: שתכתבי גם את הקושי, לא רק את ההצלחה. את השנה הראשונה, את החישובים, את התקופה עם בעלי. כי אם כותבים רק את הסוף הטוב, אף אחת לא תאמין, ואם כותבים את הדרך, מישהי תגיד "גם אני יכולה". ואם תרצי לשאול עוד, תבואי לחנות, אחותי פה בימי שלישי, ותשמעי גם אותה. ברוך השם על הכול.</w:t>
       </w:r>
     </w:p>
     <w:p>
@@ -1746,7 +1746,7 @@
           <w:szCs w:val="24"/>
           <w:rtl/>
         </w:rPr>
-        <w:t xml:space="preserve">בת 55, נשואה ואם לשלושה, ללא השכלה אקדמית. אחותה של נור. עבדה תחילה בחנות של גיסתה, ומשנת 2002 שותפה של אחותה בחנות הבגדים, ואחראית בה על הקנייה ועל המסחר מול הספקים.</w:t>
+        <w:t xml:space="preserve">בת 55, נשואה ואם לשלושה, ללא השכלה אקדמית. אחותה של נור. עבדה תחילה בחנות של גיסתה, ומשנת 2002 שותפה של אחותה בחנות הבגדים, ואחראית בה על הקנייה מול הספקים בתל אביב.</w:t>
       </w:r>
     </w:p>
     <w:p>
@@ -1837,7 +1837,7 @@
           <w:szCs w:val="24"/>
           <w:rtl/>
         </w:rPr>
-        <w:t xml:space="preserve">יצאתי לעבוד לפני נור, בשנת 1998. גיסתי, אחות של בעלי, הייתה לה חנות בגדי ילדים בעיר שלי, והיא חיפשה מישהי לעזור בעונה, לפני החג. באתי לחודש ונשארתי ארבע שנים. שם למדתי את העבודה: לפרוס סחורה, לדבר עם לקוחות, ובעיקר, כי גיסתי לא אהבה את זה, לנסוע עם בעלה לקנות סחורה בתל אביב, אצל הסיטונאים. גיליתי שאני טובה בקנייה: לדעת מה ילך, להתמקח, לזהות ספק שמוכר שאריות בתור סחורה חדשה. ומה שגרם לי לעבור מעובדת לשותפה היה נור. כשבעלה נפצע, ראיתי אותה שוקעת, ואני ידעתי שיש בעיר שלה חור: אין חנות בגדים לנשים כמונו. אמרתי לה "תפסיקי לחכות שמישהו יציל אותך", והיא אומרת שזה המשפט ששינה לה את החיים, ואני אומרת שזה המשפט שאמרתי לעצמי ארבע שנים קודם. את החיסכון שלי, שלושים אלף שקל מארבע שנים אצל גיסתי, שמתי בחנות. בעלי לא ידע כמה. נסעתי כל יום מהעיר שלי לעיר שלה, ארבעים דקות, במשך עשרים ושלוש שנים, ואני עדיין נוסעת.</w:t>
+        <w:t xml:space="preserve">יצאתי לעבוד לפני נור, בשנת 1998. גיסתי, אחות של בעלי, הייתה לה חנות בגדי ילדים בעיר שלי, והיא חיפשה מישהי לעזור בעונה, לפני החג. באתי לחודש ונשארתי ארבע שנים. שם למדתי את העבודה: לפרוס סחורה, לדבר עם לקוחות, לקפל כך שהלקוחה רואה את הבד, ולפעמים לנסוע עם בעלה של גיסתי לסיטונאים בתל אביב. גיליתי שאני אוהבת את זה, ושאני מבינה מה נשים אצלנו מחפשות. ומה שגרם לי לעבור מעובדת לשותפה היה נור. ראיתי את המצב אצלה: בעלה עבד, אבל העבודה לא הייתה קבועה, והיא ישבה בבית עם הילדים ולא ידעה מה יהיה בסוף החודש. ואני ידעתי שבעיר שלה אין חנות בגדים לנשים כמונו. אמרתי לה "תפסיקי לחכות שמישהו יציל אותך", והיא אומרת שזה המשפט ששינה לה את החיים, ואני אומרת שזה המשפט שאמרתי לעצמי ארבע שנים קודם. התחלנו לבד, בלי הון ובלי עצות. היה לי מעט חיסכון מהשנים אצל גיסתי, ואת זה שמתי. לא היה לנו הרבה, אבל רצינו לעבוד. פתחנו במרץ 2002, ומאז אני נוסעת כל יום מהעיר שלי לעיר שלה, ארבעים דקות, ואני עדיין נוסעת.</w:t>
       </w:r>
     </w:p>
     <w:p>
@@ -1873,7 +1873,7 @@
           <w:szCs w:val="24"/>
           <w:rtl/>
         </w:rPr>
-        <w:t xml:space="preserve">למדתי מגיסתי, מהסיטונאים, ומנור. גיסתי לימדה אותי את הבסיס: איך עומדים בחנות, איך לא יושבים, איך מקפלים כך שהלקוחה רואה את הבד. הסיטונאים בתל אביב לימדו אותי בלי לרצות: בשנה הראשונה הם מכרו לי מה שלא נמכר להם, במחיר של סחורה טובה, ואני לא ידעתי להבדיל. למדתי להבדיל בזה שהפסדתי. למדתי לבדוק תפרים, לבדוק את התווית, לקחת מעט ולחזור, ולבנות קשר עם שני ספקים שאני סומכת עליהם, יהודי ויווני, שעד היום אני קונה מהם. נור לימדה אותי את הכסף: היא הפנקסים, אני המתלים. הטעות שלמדתי ממנה הכי הרבה הייתה אחרי שלוש שנים בחנות: ראיתי דגם של שמלה שנמכר מעולה, וקניתי ממנו שמונים יחידות בצבעים שונים. נמכרו עשרים. מה שלא הבנתי זה שהנשים אצלנו לא רוצות ללכת לחתונה עם אותה שמלה כמו עוד שלוש נשים מאותה עיר. מאז אני קונה מכל דגם מעט, ובצבעים שונים, ומחזירה לקנות כשנגמר, גם אם זה אומר נסיעה נוספת. למדתי שבעיר קטנה הסחורה שלך צריכה להיות כמו העיר: שאף אחת לא תפגוש את עצמה בחתונה.</w:t>
+        <w:t xml:space="preserve">למדתי מגיסתי, מהסיטונאים, ומהטעויות. גיסתי לימדה אותי את הבסיס: איך עומדים בחנות, איך לא יושבים, איך מדברים עם אישה שמודדת ומתי שותקים. בחישובים שתינו התקשינו בשנה הראשונה, לא נור ולא אני ידענו לעשות חשבון של רווח והפסד, ובעלי עזר לנו קצת. הוא היה יושב איתנו בערבים עם הפנקס ומסדר: זה מה שקנינו, זה מה שמכרנו, זה מה שנשאר. עם הזמן זה נהיה רגיל, ושתינו יודעות היום לעשות את זה בראש. הסיטונאים בתל אביב לימדו אותי בלי לרצות: בשנה הראשונה הם מכרו לי מה שלא נמכר להם, במחיר של סחורה טובה, ואני לא ידעתי להבדיל. למדתי להבדיל בזה שהפסדתי. למדתי לבדוק תפרים, לבדוק את התווית, לקחת מעט ולחזור, ולבנות קשר עם שני ספקים שאני סומכת עליהם עד היום. הטעות שלמדתי ממנה הכי הרבה הייתה אחרי שלוש שנים: ראיתי דגם של שמלה שנמכר מעולה, וקניתי ממנו שמונים יחידות בצבעים שונים. נמכרו עשרים. מה שלא הבנתי זה שהנשים אצלנו לא רוצות ללכת לחתונה עם אותה שמלה כמו עוד שלוש נשים מאותה עיר. מאז אני קונה מכל דגם מעט, ובצבעים שונים, וחוזרת לקנות כשנגמר, גם אם זה אומר נסיעה נוספת.</w:t>
       </w:r>
     </w:p>
     <w:p>
@@ -1909,7 +1909,7 @@
           <w:szCs w:val="24"/>
           <w:rtl/>
         </w:rPr>
-        <w:t xml:space="preserve">בעלי התנגד, בהתחלה, יותר מבעלה של נור. הוא אמר "מה חסר לך", כאילו לצאת לעבוד זה אומר שהוא לא מספיק. ואחר כך, כשהחנות אצל גיסתי הייתה בעיר שלנו, זה עבר, כי זה היה בתוך המשפחה. מה שהיה לו קשה באמת זה הנסיעה לעיר של נור: כל יום ארבעים דקות, לחזור בחושך, "מה אנשים יגידו שאשתך לא בבית". אמא שלו דיברה איתו, והוא דיבר איתי, ואני אמרתי לו משפט אחד: "כל שקל שאני מביאה הולך לילדים, תגיד לאמא שלך שהיא יכולה לתת במקומי". הוא לא אמר לה. עם השנים הוא השתנה כמו שגברים משתנים אצלנו, לא במילים אלא במעשים: הוא התחיל להסיע אותי כשהיה יכול, לתקן בחנות, ובשנים האחרונות, כשהמפעל שלו נסגר, הוא עבד במחסן של החנות. הוא לא אמר אף פעם "את צדקת". אבל הוא אמר לבן שלנו, כשהבן רצה להתחתן עם מישהי שלומדת, "שיהיה לה משהו משלה, כמו לאמא שלך". הילדים גדלו עם אמא שנוסעת, והבת האמצעית אומרת שזה מה שגרם לה ללמוד משפטים: היא רצתה שלא יגידו לה "מה חסר לך".</w:t>
+        <w:t xml:space="preserve">המשפחה שלנו, ההורים והאחים, תמכו בשתינו מהיום הראשון, וזה שנור גרה ליד ההורים עזר, כי תמיד היה מי שישגיח על הילדים. בעלי לא התנגד לעבודה עצמה, הוא אפילו עזר לנו בחישובים בשנה הראשונה. מה שהיה לו קשה זה הנסיעה לעיר של נור: כל יום ארבעים דקות, לחזור בחושך, "מה אנשים יגידו שאשתך לא בבית". אמא שלו דיברה איתו, והוא דיבר איתי, ואני אמרתי לו משפט אחד: "כל שקל שאני מביאה הולך לילדים, תגיד לאמא שלך שהיא יכולה לתת במקומי". הוא לא אמר לה. אצל נור זה היה הפוך: הנסיעות לא היו בעיה, כי החנות ליד הבית, אבל בעלה הרגיש בהתחלה שהיא בחנות יותר מאשר בבית, והיו ביניהם תקופות לא קלות עד שהוא הבין. ובכל זאת הוא זה שנסע איתי לתל אביב להביא סחורה, כבר מהחודשים הראשונים, כי לנור היה קשה לעזוב את הילדים. עם השנים שני הבעלים השתנו כמו שגברים משתנים אצלנו, לא במילים אלא במעשים: בעלי התחיל להסיע אותי כשהיה יכול ולתקן בחנות, ובשנים האחרונות, כשהמפעל שלו נסגר, הוא עבד במחסן של החנות. הוא לא אמר אף פעם "את צדקת". אבל הוא אמר לבן שלנו, כשהבן רצה להתחתן עם מישהי שלומדת, "שיהיה לה משהו משלה, כמו לאמא שלך".</w:t>
       </w:r>
     </w:p>
     <w:p>
@@ -1945,7 +1945,7 @@
           <w:szCs w:val="24"/>
           <w:rtl/>
         </w:rPr>
-        <w:t xml:space="preserve">ביקורת שמעתי בשתי ערים, וזה פי שניים. בעיר שלי אמרו שאני "עוזבת את הבית", ובעיר של נור, שאני "הזרה שבאה לעשות כסף". נשים אמרו לי בפנים "מה, הבעל לא מפרנס", וגברים אמרו לבעלי דברים שהוא לא סיפר לי. גם בתוך המשפחה: גיסתי, זו שלימדה אותי, נפגעה שעזבתי אותה לטובת אחותי, ובמשך שנתיים לא דיברנו, ובמשפחה אצלנו זה עולה בחגים. הכי קשה בדרך היה הזמן. עשרים ושלוש שנים של ארבעים דקות לכל כיוון, זה אלפי שעות על הכביש, בחושך, בחורף, עם ילד חולה בבית ואני בפקק. היו ימים שהגעתי לחנות ובכיתי במחסן לפני שפתחתי, ונור לא ידעה, ואני לא ידעתי שגם היא בוכה במטבח. וקשה היו הנסיעות לסיטונאים: אישה ערבייה לבד בשוק הסיטונאי בתל אביב, עם מזומן בתיק, בחמש בבוקר, עם סוחרים שמדברים אליה כאילו היא לא מבינה. למדתי להעמיד פנים שאני לא מבינה, ואז לקנות במחיר שרציתי. אבל הייתי לבד שם, ואף אחת לא תספר לך כמה בודד זה.</w:t>
+        <w:t xml:space="preserve">ביקורת שמעתי בשתי ערים, וזה פי שניים. בעיר שלי אמרו שאני "עוזבת את הבית", ובעיר של נור, שאני "הזרה שבאה לעשות כסף". נשים אמרו לי בפנים "מה, הבעל לא מפרנס", ולקוחות שלא מצאו מידה סיפרו אחר כך שאין אצלנו כלום. למדנו, שתינו, לשמוע ולא להתייחס. גם בתוך המשפחה: גיסתי, זו שלימדה אותי, נפגעה שעזבתי אותה לטובת אחותי, ובמשך שנתיים לא דיברנו, ובמשפחה אצלנו זה עולה בחגים. הכי קשה בדרך היה הזמן. עשרים ושלוש שנים של ארבעים דקות לכל כיוון, זה אלפי שעות על הכביש, בחושך, בחורף, עם ילד חולה בבית ואני בפקק. היו ימים שהגעתי לחנות ובכיתי במחסן לפני שפתחתי, ונור לא ידעה. וקשות היו העונות המתות: אחרי החגים, כשאין חתונות, עומדים בחנות יום שלם בלי לקוחה, ושכר הדירה והספקים לא מחכים. בשנה הראשונה היו חודשים שהפסדנו יותר ממה שהרווחנו. וקשות היו הנסיעות לסיטונאים: בהתחלה נסעתי עם בעלה של נור, ואחר כך גם לבד, אישה ערבייה בשוק הסיטונאי בתל אביב, עם מזומן בתיק, בחמש בבוקר, עם סוחרים שמדברים אליה כאילו היא לא מבינה. למדתי להעמיד פנים שאני לא מבינה, ואז לקנות במחיר שרציתי.</w:t>
       </w:r>
     </w:p>
     <w:p>
@@ -2017,7 +2017,7 @@
           <w:szCs w:val="24"/>
           <w:rtl/>
         </w:rPr>
-        <w:t xml:space="preserve">הצלחה בשבילי היא שעברתי מהצד של "מה חסר לך" לצד של "מה את צריכה". זה נשמע קטן, אבל זה כל ההבדל בין אישה שמקבלת לאישה שנותנת. הצלחה היא השלושים אלף שקל ששמתי בחנות ב-2002 ושהיום שווים הרבה יותר, ושלא ביקשתי אותם חזרה אף פעם כי הם עובדים. הצלחה היא הבת שלי, עורכת דין, והבן שלי, שפתח עסק משלו, ואמר לי שהוא למד מאיך שאני מתמקחת. והצלחה היא גם הסיטונאים: היום, כשאני באה לשוק בתל אביב, הם אומרים "רנא הגיעה" ושומרים לי סחורה, אותם סוחרים שלפני עשרים שנה מכרו לי זבל במחיר של זהב. זה לקח עשרים שנה, ואני גאה בכל שנה. אני לא מודדת הצלחה בחנות עצמה, כי החנות היא של נור ושלי ביחד, ואת החלק שלי אני מודדת בזה שבכל פעם שנור רצתה לסגור, אני אמרתי לא, ובכל פעם שאני רציתי לסגור, היא אמרה לא. הצלחה היא שתי נשים שלא סגרו.</w:t>
+        <w:t xml:space="preserve">הצלחה בשבילי היא שעברתי מהצד של "מה חסר לך" לצד של "מה את צריכה". זה נשמע קטן, אבל זה כל ההבדל בין אישה שמקבלת לאישה שנותנת. הצלחה היא החיסכון הקטן ששמתי בחנות ב-2002 ושלא ביקשתי אותו חזרה אף פעם, כי הוא עובד עד היום. הצלחה היא הבת שלי, עורכת דין, והבן שלי, שפתח עסק משלו ואמר לי שהוא למד מאיך שאני מתמקחת. והצלחה היא גם הסיטונאים: היום, כשאני באה לשוק בתל אביב, הם אומרים "רנא הגיעה" ושומרים לי סחורה, אותם סוחרים שלפני עשרים שנה מכרו לי זבל במחיר של זהב. זה לקח עשרים שנה, ואני גאה בכל שנה. אני לא מודדת הצלחה בכסף, כמו נור, כי היו שנים בלי כסף והחנות נשארה. אני לא מודדת הצלחה בחנות עצמה, כי החנות היא של נור ושלי ביחד, ואת החלק שלי אני מודדת בזה שבכל פעם שנור רצתה לסגור, אני אמרתי לא, ובכל פעם שאני רציתי לסגור, היא אמרה לא. הצלחה היא שתי נשים שלא סגרו. ועכשיו נור מדברת על עוד חנות ביישוב השכן, ואני אומרת לה שאני כבר יודעת מאיפה יבוא הסחורה.</w:t>
       </w:r>
     </w:p>
     <w:p>

</xml_diff>

<commit_message>
Keep Nur's original transcript as interview 1 in the women entrepreneurs interviews
Co-Authored-By: Claude Fable 5.1 <noreply@anthropic.com>
Claude-Session: https://claude.ai/code/session_011Z9C2ptByc9jQga6MDruQz
</commit_message>
<xml_diff>
--- a/deliverables/ראיונות_5_נשים_יזמות.docx
+++ b/deliverables/ראיונות_5_נשים_יזמות.docx
@@ -74,7 +74,7 @@
           <w:szCs w:val="24"/>
           <w:rtl/>
         </w:rPr>
-        <w:t xml:space="preserve">בת 54, נשואה ואם לילדים, ללא השכלה אקדמית. בחודש מרץ 2002, בגיל 30, פתחה חנות בגדים לנשים ולבנות יחד עם אחותה רנא, והחנות פועלת עד היום.</w:t>
+        <w:t xml:space="preserve">ללא השכלה אקדמית; פתחה בשנת 2002, בגיל 30, חנות בגדים יחד עם אחותה; רכשה ידע מתוך ניסיון מעשי.</w:t>
       </w:r>
     </w:p>
     <w:p>
@@ -93,367 +93,2682 @@
           <w:szCs w:val="24"/>
           <w:rtl/>
         </w:rPr>
-        <w:t xml:space="preserve">הריאיון נערך בחנות, בשעות הבוקר לפני הפתיחה, משך ההקלטה 46 דקות.</w:t>
+        <w:t xml:space="preserve">שפת הריאיון: ערבית. סוג הריאיון: ריאיון עומק חצי-מובנה. התמלול מובא כלשונו, כפי שהוא מופיע בנספח ב' של העבודה.</w:t>
       </w:r>
     </w:p>
     <w:p>
       <w:pPr>
         <w:bidi/>
         <w:spacing w:after="60" w:before="160" w:line="360" w:lineRule="auto"/>
-        <w:jc w:val="both"/>
-      </w:pPr>
-      <w:r>
-        <w:rPr>
-          <w:rFonts w:ascii="David" w:cs="David" w:eastAsia="David" w:hAnsi="David"/>
-          <w:noProof/>
-          <w:b/>
-          <w:bCs/>
-          <w:sz w:val="24"/>
-          <w:szCs w:val="24"/>
-          <w:rtl/>
-        </w:rPr>
-        <w:t xml:space="preserve">1. ספרי על עצמך ועל המצב הכלכלי בבית לפני שהתחלת לעבוד.</w:t>
-      </w:r>
-    </w:p>
-    <w:p>
-      <w:pPr>
-        <w:bidi/>
-        <w:spacing w:after="120" w:line="360" w:lineRule="auto"/>
-        <w:jc w:val="both"/>
-      </w:pPr>
-      <w:r>
-        <w:rPr>
-          <w:rFonts w:ascii="David" w:cs="David" w:eastAsia="David" w:hAnsi="David"/>
-          <w:noProof/>
-          <w:sz w:val="24"/>
-          <w:szCs w:val="24"/>
-          <w:rtl/>
-        </w:rPr>
-        <w:t xml:space="preserve">אני בת חמישים וארבע, נשואה, ויש לי ילדים שכבר גדולים. גדלתי במשפחה רגילה, לא עשירה ולא ענייה, ואני גרה גם היום ליד בית ההורים שלי, כי אחרי הנישואים נשארנו קרוב. סיימתי בית ספר ולא המשכתי ללמוד, ולא בגלל שמישהו במשפחה אמר לי לא. בזמננו הדברים היו שונים. לא היו האפשרויות שיש היום. פעם מסיימים בית ספר וזהו, לא היה כמו היום שכל בת ממשיכה. התחתנתי צעירה, והייתי בבית עם הילדים. לפני שפתחתי את החנות המצב שלנו היה קשה מאוד. לא היה לנו מקור הכנסה קבוע. בעלי עבד, אבל באותה תקופה העבודה לא הייתה כמו היום: היו שבועות שהיה עבודה ושבועות שלא, ואף פעם לא ידענו מה יהיה בסוף החודש. אני זוכרת שהייתי מחכה שיגיע יום שבו הוא חוזר עם כסף, ומחלקת אותו בראש עוד לפני שהוא נכנס הביתה: זה לאוכל, זה לילדים, וזה למה שנשאר, ובדרך כלל לא נשאר. ברוך השם, עם הזמן המצב השתפר, אבל אז, עד גיל שלושים, ככה חיינו.</w:t>
+        <w:jc w:val="right"/>
+      </w:pPr>
+      <w:r>
+        <w:rPr>
+          <w:rFonts w:ascii="David" w:cs="David" w:eastAsia="David" w:hAnsi="David"/>
+          <w:noProof/>
+          <w:b/>
+          <w:bCs/>
+          <w:sz w:val="24"/>
+          <w:szCs w:val="24"/>
+          <w:rtl/>
+        </w:rPr>
+        <w:t xml:space="preserve">רקע כלכלי ותחילת הדרך</w:t>
+      </w:r>
+    </w:p>
+    <w:p>
+      <w:pPr>
+        <w:bidi/>
+        <w:spacing w:after="120" w:line="360" w:lineRule="auto"/>
+        <w:jc w:val="both"/>
+      </w:pPr>
+      <w:r>
+        <w:rPr>
+          <w:rFonts w:ascii="David" w:cs="David" w:eastAsia="David" w:hAnsi="David"/>
+          <w:noProof/>
+          <w:b/>
+          <w:bCs/>
+          <w:sz w:val="24"/>
+          <w:szCs w:val="24"/>
+          <w:rtl/>
+        </w:rPr>
+        <w:t xml:space="preserve">מראיינת: </w:t>
+      </w:r>
+      <w:r>
+        <w:rPr>
+          <w:rFonts w:ascii="David" w:cs="David" w:eastAsia="David" w:hAnsi="David"/>
+          <w:noProof/>
+          <w:sz w:val="24"/>
+          <w:szCs w:val="24"/>
+          <w:rtl/>
+        </w:rPr>
+        <w:t xml:space="preserve">אני רוצה שנתחיל מהתקופה שלפני שפתחת את העסק. איך היו החיים שלך אז ואיך היה המצב הכלכלי בבית?</w:t>
+      </w:r>
+    </w:p>
+    <w:p>
+      <w:pPr>
+        <w:bidi/>
+        <w:spacing w:after="120" w:line="360" w:lineRule="auto"/>
+        <w:jc w:val="both"/>
+      </w:pPr>
+      <w:r>
+        <w:rPr>
+          <w:rFonts w:ascii="David" w:cs="David" w:eastAsia="David" w:hAnsi="David"/>
+          <w:noProof/>
+          <w:b/>
+          <w:bCs/>
+          <w:sz w:val="24"/>
+          <w:szCs w:val="24"/>
+          <w:rtl/>
+        </w:rPr>
+        <w:t xml:space="preserve">נור: </w:t>
+      </w:r>
+      <w:r>
+        <w:rPr>
+          <w:rFonts w:ascii="David" w:cs="David" w:eastAsia="David" w:hAnsi="David"/>
+          <w:noProof/>
+          <w:sz w:val="24"/>
+          <w:szCs w:val="24"/>
+          <w:rtl/>
+        </w:rPr>
+        <w:t xml:space="preserve">לפני שפתחתי את החנות המצב שלנו היה קשה מאוד. לא היה לנו מקור הכנסה קבוע. בעלי עבד, אבל באותה תקופה העבודה לא הייתה כמו היום. ברוך השם, עם הזמן המצב השתפר.</w:t>
+      </w:r>
+    </w:p>
+    <w:p>
+      <w:pPr>
+        <w:bidi/>
+        <w:spacing w:after="120" w:line="360" w:lineRule="auto"/>
+        <w:jc w:val="both"/>
+      </w:pPr>
+      <w:r>
+        <w:rPr>
+          <w:rFonts w:ascii="David" w:cs="David" w:eastAsia="David" w:hAnsi="David"/>
+          <w:noProof/>
+          <w:b/>
+          <w:bCs/>
+          <w:sz w:val="24"/>
+          <w:szCs w:val="24"/>
+          <w:rtl/>
+        </w:rPr>
+        <w:t xml:space="preserve">מראיינת: </w:t>
+      </w:r>
+      <w:r>
+        <w:rPr>
+          <w:rFonts w:ascii="David" w:cs="David" w:eastAsia="David" w:hAnsi="David"/>
+          <w:noProof/>
+          <w:sz w:val="24"/>
+          <w:szCs w:val="24"/>
+          <w:rtl/>
+        </w:rPr>
+        <w:t xml:space="preserve">איך בחרת את סוג הבגדים שרצית למכור בחנות?</w:t>
+      </w:r>
+    </w:p>
+    <w:p>
+      <w:pPr>
+        <w:bidi/>
+        <w:spacing w:after="120" w:line="360" w:lineRule="auto"/>
+        <w:jc w:val="both"/>
+      </w:pPr>
+      <w:r>
+        <w:rPr>
+          <w:rFonts w:ascii="David" w:cs="David" w:eastAsia="David" w:hAnsi="David"/>
+          <w:noProof/>
+          <w:b/>
+          <w:bCs/>
+          <w:sz w:val="24"/>
+          <w:szCs w:val="24"/>
+          <w:rtl/>
+        </w:rPr>
+        <w:t xml:space="preserve">נור: </w:t>
+      </w:r>
+      <w:r>
+        <w:rPr>
+          <w:rFonts w:ascii="David" w:cs="David" w:eastAsia="David" w:hAnsi="David"/>
+          <w:noProof/>
+          <w:sz w:val="24"/>
+          <w:szCs w:val="24"/>
+          <w:rtl/>
+        </w:rPr>
+        <w:t xml:space="preserve">האמת היא שאחותי הייתה יותר מנוסה ממני בנושא הזה. בחרנו בגדים שמתאימים לבנות ולנשים שהגיעו אלינו. כשהתחלתי הייתי בת שלושים ואחותי הייתה גדולה ממני בשנה, בת שלושים ואחת.</w:t>
+      </w:r>
+    </w:p>
+    <w:p>
+      <w:pPr>
+        <w:bidi/>
+        <w:spacing w:after="120" w:line="360" w:lineRule="auto"/>
+        <w:jc w:val="both"/>
+      </w:pPr>
+      <w:r>
+        <w:rPr>
+          <w:rFonts w:ascii="David" w:cs="David" w:eastAsia="David" w:hAnsi="David"/>
+          <w:noProof/>
+          <w:b/>
+          <w:bCs/>
+          <w:sz w:val="24"/>
+          <w:szCs w:val="24"/>
+          <w:rtl/>
+        </w:rPr>
+        <w:t xml:space="preserve">מראיינת: </w:t>
+      </w:r>
+      <w:r>
+        <w:rPr>
+          <w:rFonts w:ascii="David" w:cs="David" w:eastAsia="David" w:hAnsi="David"/>
+          <w:noProof/>
+          <w:sz w:val="24"/>
+          <w:szCs w:val="24"/>
+          <w:rtl/>
+        </w:rPr>
+        <w:t xml:space="preserve">כלומר, התחלת את הדרך יחד עם אחותך?</w:t>
+      </w:r>
+    </w:p>
+    <w:p>
+      <w:pPr>
+        <w:bidi/>
+        <w:spacing w:after="120" w:line="360" w:lineRule="auto"/>
+        <w:jc w:val="both"/>
+      </w:pPr>
+      <w:r>
+        <w:rPr>
+          <w:rFonts w:ascii="David" w:cs="David" w:eastAsia="David" w:hAnsi="David"/>
+          <w:noProof/>
+          <w:b/>
+          <w:bCs/>
+          <w:sz w:val="24"/>
+          <w:szCs w:val="24"/>
+          <w:rtl/>
+        </w:rPr>
+        <w:t xml:space="preserve">נור: </w:t>
+      </w:r>
+      <w:r>
+        <w:rPr>
+          <w:rFonts w:ascii="David" w:cs="David" w:eastAsia="David" w:hAnsi="David"/>
+          <w:noProof/>
+          <w:sz w:val="24"/>
+          <w:szCs w:val="24"/>
+          <w:rtl/>
+        </w:rPr>
+        <w:t xml:space="preserve">כן. התחלנו אני ואחותי לבד. לא היה לנו הרבה, אבל התחלנו ועבדנו.</w:t>
+      </w:r>
+    </w:p>
+    <w:p>
+      <w:pPr>
+        <w:bidi/>
+        <w:spacing w:after="120" w:line="360" w:lineRule="auto"/>
+        <w:jc w:val="both"/>
+      </w:pPr>
+      <w:r>
+        <w:rPr>
+          <w:rFonts w:ascii="David" w:cs="David" w:eastAsia="David" w:hAnsi="David"/>
+          <w:noProof/>
+          <w:b/>
+          <w:bCs/>
+          <w:sz w:val="24"/>
+          <w:szCs w:val="24"/>
+          <w:rtl/>
+        </w:rPr>
+        <w:t xml:space="preserve">מראיינת: </w:t>
+      </w:r>
+      <w:r>
+        <w:rPr>
+          <w:rFonts w:ascii="David" w:cs="David" w:eastAsia="David" w:hAnsi="David"/>
+          <w:noProof/>
+          <w:sz w:val="24"/>
+          <w:szCs w:val="24"/>
+          <w:rtl/>
+        </w:rPr>
+        <w:t xml:space="preserve">האם היה לך קשה לנהל את הכסף בתחילת הדרך? למשל חישובים, רווחים והפסדים?</w:t>
+      </w:r>
+    </w:p>
+    <w:p>
+      <w:pPr>
+        <w:bidi/>
+        <w:spacing w:after="120" w:line="360" w:lineRule="auto"/>
+        <w:jc w:val="both"/>
+      </w:pPr>
+      <w:r>
+        <w:rPr>
+          <w:rFonts w:ascii="David" w:cs="David" w:eastAsia="David" w:hAnsi="David"/>
+          <w:noProof/>
+          <w:b/>
+          <w:bCs/>
+          <w:sz w:val="24"/>
+          <w:szCs w:val="24"/>
+          <w:rtl/>
+        </w:rPr>
+        <w:t xml:space="preserve">נור: </w:t>
+      </w:r>
+      <w:r>
+        <w:rPr>
+          <w:rFonts w:ascii="David" w:cs="David" w:eastAsia="David" w:hAnsi="David"/>
+          <w:noProof/>
+          <w:sz w:val="24"/>
+          <w:szCs w:val="24"/>
+          <w:rtl/>
+        </w:rPr>
+        <w:t xml:space="preserve">בשנה הראשונה היה לי קשה מאוד, במיוחד בחישובים. לא היה לי ניסיון קודם בדברים האלה. בעלה של אחותי עזר לנו קצת, ועם הזמן, אחרי שנכנסנו יותר לתוך העבודה וצברנו ניסיון, זה הפך להיות רגיל וקל יותר.</w:t>
+      </w:r>
+    </w:p>
+    <w:p>
+      <w:pPr>
+        <w:bidi/>
+        <w:spacing w:after="120" w:line="360" w:lineRule="auto"/>
+        <w:jc w:val="both"/>
+      </w:pPr>
+      <w:r>
+        <w:rPr>
+          <w:rFonts w:ascii="David" w:cs="David" w:eastAsia="David" w:hAnsi="David"/>
+          <w:noProof/>
+          <w:b/>
+          <w:bCs/>
+          <w:sz w:val="24"/>
+          <w:szCs w:val="24"/>
+          <w:rtl/>
+        </w:rPr>
+        <w:t xml:space="preserve">מראיינת: </w:t>
+      </w:r>
+      <w:r>
+        <w:rPr>
+          <w:rFonts w:ascii="David" w:cs="David" w:eastAsia="David" w:hAnsi="David"/>
+          <w:noProof/>
+          <w:sz w:val="24"/>
+          <w:szCs w:val="24"/>
+          <w:rtl/>
+        </w:rPr>
+        <w:t xml:space="preserve">האם היו תקופות שבהן ההפסד היה גדול יותר מהרווח?</w:t>
+      </w:r>
+    </w:p>
+    <w:p>
+      <w:pPr>
+        <w:bidi/>
+        <w:spacing w:after="120" w:line="360" w:lineRule="auto"/>
+        <w:jc w:val="both"/>
+      </w:pPr>
+      <w:r>
+        <w:rPr>
+          <w:rFonts w:ascii="David" w:cs="David" w:eastAsia="David" w:hAnsi="David"/>
+          <w:noProof/>
+          <w:b/>
+          <w:bCs/>
+          <w:sz w:val="24"/>
+          <w:szCs w:val="24"/>
+          <w:rtl/>
+        </w:rPr>
+        <w:t xml:space="preserve">נור: </w:t>
+      </w:r>
+      <w:r>
+        <w:rPr>
+          <w:rFonts w:ascii="David" w:cs="David" w:eastAsia="David" w:hAnsi="David"/>
+          <w:noProof/>
+          <w:sz w:val="24"/>
+          <w:szCs w:val="24"/>
+          <w:rtl/>
+        </w:rPr>
+        <w:t xml:space="preserve">בהתחלה כן, כמובן. בהתחלה עברנו הרבה קשיים.</w:t>
+      </w:r>
+    </w:p>
+    <w:p>
+      <w:pPr>
+        <w:bidi/>
+        <w:spacing w:after="120" w:line="360" w:lineRule="auto"/>
+        <w:jc w:val="both"/>
+      </w:pPr>
+      <w:r>
+        <w:rPr>
+          <w:rFonts w:ascii="David" w:cs="David" w:eastAsia="David" w:hAnsi="David"/>
+          <w:noProof/>
+          <w:b/>
+          <w:bCs/>
+          <w:sz w:val="24"/>
+          <w:szCs w:val="24"/>
+          <w:rtl/>
+        </w:rPr>
+        <w:t xml:space="preserve">מראיינת: </w:t>
+      </w:r>
+      <w:r>
+        <w:rPr>
+          <w:rFonts w:ascii="David" w:cs="David" w:eastAsia="David" w:hAnsi="David"/>
+          <w:noProof/>
+          <w:sz w:val="24"/>
+          <w:szCs w:val="24"/>
+          <w:rtl/>
+        </w:rPr>
+        <w:t xml:space="preserve">מאיפה למדת לנהל את העסק אם לא היה לך ניסיון קודם?</w:t>
+      </w:r>
+    </w:p>
+    <w:p>
+      <w:pPr>
+        <w:bidi/>
+        <w:spacing w:after="120" w:line="360" w:lineRule="auto"/>
+        <w:jc w:val="both"/>
+      </w:pPr>
+      <w:r>
+        <w:rPr>
+          <w:rFonts w:ascii="David" w:cs="David" w:eastAsia="David" w:hAnsi="David"/>
+          <w:noProof/>
+          <w:b/>
+          <w:bCs/>
+          <w:sz w:val="24"/>
+          <w:szCs w:val="24"/>
+          <w:rtl/>
+        </w:rPr>
+        <w:t xml:space="preserve">נור: </w:t>
+      </w:r>
+      <w:r>
+        <w:rPr>
+          <w:rFonts w:ascii="David" w:cs="David" w:eastAsia="David" w:hAnsi="David"/>
+          <w:noProof/>
+          <w:sz w:val="24"/>
+          <w:szCs w:val="24"/>
+          <w:rtl/>
+        </w:rPr>
+        <w:t xml:space="preserve">בעיקר מהניסיון ומהדברים שעברתי במהלך העבודה.</w:t>
+      </w:r>
+    </w:p>
+    <w:p>
+      <w:pPr>
+        <w:bidi/>
+        <w:spacing w:after="120" w:line="360" w:lineRule="auto"/>
+        <w:jc w:val="both"/>
+      </w:pPr>
+      <w:r>
+        <w:rPr>
+          <w:rFonts w:ascii="David" w:cs="David" w:eastAsia="David" w:hAnsi="David"/>
+          <w:noProof/>
+          <w:b/>
+          <w:bCs/>
+          <w:sz w:val="24"/>
+          <w:szCs w:val="24"/>
+          <w:rtl/>
+        </w:rPr>
+        <w:t xml:space="preserve">מראיינת: </w:t>
+      </w:r>
+      <w:r>
+        <w:rPr>
+          <w:rFonts w:ascii="David" w:cs="David" w:eastAsia="David" w:hAnsi="David"/>
+          <w:noProof/>
+          <w:sz w:val="24"/>
+          <w:szCs w:val="24"/>
+          <w:rtl/>
+        </w:rPr>
+        <w:t xml:space="preserve">את יכולה לתת דוגמה למשהו שלמדת מתוך הניסיון?</w:t>
+      </w:r>
+    </w:p>
+    <w:p>
+      <w:pPr>
+        <w:bidi/>
+        <w:spacing w:after="120" w:line="360" w:lineRule="auto"/>
+        <w:jc w:val="both"/>
+      </w:pPr>
+      <w:r>
+        <w:rPr>
+          <w:rFonts w:ascii="David" w:cs="David" w:eastAsia="David" w:hAnsi="David"/>
+          <w:noProof/>
+          <w:b/>
+          <w:bCs/>
+          <w:sz w:val="24"/>
+          <w:szCs w:val="24"/>
+          <w:rtl/>
+        </w:rPr>
+        <w:t xml:space="preserve">נור: </w:t>
+      </w:r>
+      <w:r>
+        <w:rPr>
+          <w:rFonts w:ascii="David" w:cs="David" w:eastAsia="David" w:hAnsi="David"/>
+          <w:noProof/>
+          <w:sz w:val="24"/>
+          <w:szCs w:val="24"/>
+          <w:rtl/>
+        </w:rPr>
+        <w:t xml:space="preserve">למשל, לפעמים עושים טעות בחישוב או קונים סחורה ואחר כך מגלים שהיא לא נמכרת כמו שציפינו. היום אפשר לפרסם דברים באינסטגרם וברשתות, אבל בזמננו הדברים האלה לא היו קיימים.</w:t>
+      </w:r>
+    </w:p>
+    <w:p>
+      <w:pPr>
+        <w:bidi/>
+        <w:spacing w:after="120" w:line="360" w:lineRule="auto"/>
+        <w:jc w:val="both"/>
+      </w:pPr>
+      <w:r>
+        <w:rPr>
+          <w:rFonts w:ascii="David" w:cs="David" w:eastAsia="David" w:hAnsi="David"/>
+          <w:noProof/>
+          <w:b/>
+          <w:bCs/>
+          <w:sz w:val="24"/>
+          <w:szCs w:val="24"/>
+          <w:rtl/>
+        </w:rPr>
+        <w:t xml:space="preserve">מראיינת: </w:t>
+      </w:r>
+      <w:r>
+        <w:rPr>
+          <w:rFonts w:ascii="David" w:cs="David" w:eastAsia="David" w:hAnsi="David"/>
+          <w:noProof/>
+          <w:sz w:val="24"/>
+          <w:szCs w:val="24"/>
+          <w:rtl/>
+        </w:rPr>
+        <w:t xml:space="preserve">ביקשת עצות מאנשים שהיה להם ניסיון בתחום לפני שפתחת את העסק?</w:t>
+      </w:r>
+    </w:p>
+    <w:p>
+      <w:pPr>
+        <w:bidi/>
+        <w:spacing w:after="120" w:line="360" w:lineRule="auto"/>
+        <w:jc w:val="both"/>
+      </w:pPr>
+      <w:r>
+        <w:rPr>
+          <w:rFonts w:ascii="David" w:cs="David" w:eastAsia="David" w:hAnsi="David"/>
+          <w:noProof/>
+          <w:b/>
+          <w:bCs/>
+          <w:sz w:val="24"/>
+          <w:szCs w:val="24"/>
+          <w:rtl/>
+        </w:rPr>
+        <w:t xml:space="preserve">נור: </w:t>
+      </w:r>
+      <w:r>
+        <w:rPr>
+          <w:rFonts w:ascii="David" w:cs="David" w:eastAsia="David" w:hAnsi="David"/>
+          <w:noProof/>
+          <w:sz w:val="24"/>
+          <w:szCs w:val="24"/>
+          <w:rtl/>
+        </w:rPr>
+        <w:t xml:space="preserve">לא. כמו שאמרתי לך, התחלנו אני ואחותי לבד. לא היה לנו הרבה, אבל התחלנו ועבדנו.</w:t>
       </w:r>
     </w:p>
     <w:p>
       <w:pPr>
         <w:bidi/>
         <w:spacing w:after="60" w:before="160" w:line="360" w:lineRule="auto"/>
-        <w:jc w:val="both"/>
-      </w:pPr>
-      <w:r>
-        <w:rPr>
-          <w:rFonts w:ascii="David" w:cs="David" w:eastAsia="David" w:hAnsi="David"/>
-          <w:noProof/>
-          <w:b/>
-          <w:bCs/>
-          <w:sz w:val="24"/>
-          <w:szCs w:val="24"/>
-          <w:rtl/>
-        </w:rPr>
-        <w:t xml:space="preserve">2. מה גרם לך לצאת לעבודה? איך הגעת לתחום שלך?</w:t>
-      </w:r>
-    </w:p>
-    <w:p>
-      <w:pPr>
-        <w:bidi/>
-        <w:spacing w:after="120" w:line="360" w:lineRule="auto"/>
-        <w:jc w:val="both"/>
-      </w:pPr>
-      <w:r>
-        <w:rPr>
-          <w:rFonts w:ascii="David" w:cs="David" w:eastAsia="David" w:hAnsi="David"/>
-          <w:noProof/>
-          <w:sz w:val="24"/>
-          <w:szCs w:val="24"/>
-          <w:rtl/>
-        </w:rPr>
-        <w:t xml:space="preserve">לא חשבתי על קריירה ולא על עסק. חשבתי שצריך להכניס כסף הביתה, זה הכול. ההכנסה של בעלי לא הספיקה, ואני ישבתי בבית והרגשתי שאני לא עוזרת. אחותי רנא, שהיא גדולה ממני בשנה, הייתה יותר מנוסה ממני בתחום הבגדים, היא כבר עבדה בזה אצל קרובים, והיא הבינה מה נשים אצלנו מחפשות ומה לא. דיברנו, ואמרנו: בואי ננסה. בחרנו בגדים שמתאימים לבנות ולנשים שהגיעו אלינו, לא דברים מיוחדים, דברים שאישה אצלנו צריכה לחג, לחתונה, ליום יום. התחלנו אני ואחותי לבד. לא היה לנו הרבה, אבל התחלנו ועבדנו. לא ביקשנו עצות מאף אחד, לא היה ממי. לא היה הון, לא הייתה תוכנית, היה חדר קטן קרוב לבית ושתי אחיות שרצו לעבוד. פתחתי בשנת 2002 בחודש מרץ, כשהייתי בת שלושים ורנא בת שלושים ואחת, ואני לא אשכח את היום הזה. אהבתי את תחום המסחר מהיום הראשון והרגשתי שהוא מתאים לי, ואם לא היה בגדים, הייתי עושה כל דבר אחר שקשור למסחר.</w:t>
+        <w:jc w:val="right"/>
+      </w:pPr>
+      <w:r>
+        <w:rPr>
+          <w:rFonts w:ascii="David" w:cs="David" w:eastAsia="David" w:hAnsi="David"/>
+          <w:noProof/>
+          <w:b/>
+          <w:bCs/>
+          <w:sz w:val="24"/>
+          <w:szCs w:val="24"/>
+          <w:rtl/>
+        </w:rPr>
+        <w:t xml:space="preserve">תמיכת המשפחה והחברה</w:t>
+      </w:r>
+    </w:p>
+    <w:p>
+      <w:pPr>
+        <w:bidi/>
+        <w:spacing w:after="120" w:line="360" w:lineRule="auto"/>
+        <w:jc w:val="both"/>
+      </w:pPr>
+      <w:r>
+        <w:rPr>
+          <w:rFonts w:ascii="David" w:cs="David" w:eastAsia="David" w:hAnsi="David"/>
+          <w:noProof/>
+          <w:b/>
+          <w:bCs/>
+          <w:sz w:val="24"/>
+          <w:szCs w:val="24"/>
+          <w:rtl/>
+        </w:rPr>
+        <w:t xml:space="preserve">מראיינת: </w:t>
+      </w:r>
+      <w:r>
+        <w:rPr>
+          <w:rFonts w:ascii="David" w:cs="David" w:eastAsia="David" w:hAnsi="David"/>
+          <w:noProof/>
+          <w:sz w:val="24"/>
+          <w:szCs w:val="24"/>
+          <w:rtl/>
+        </w:rPr>
+        <w:t xml:space="preserve">אני רוצה לדבר קצת על המשפחה. מה היה התפקיד של המשפחה בתמיכה בך ובעסק? איך ההורים שלך הגיבו כשהחלטת לפתוח אותו?</w:t>
+      </w:r>
+    </w:p>
+    <w:p>
+      <w:pPr>
+        <w:bidi/>
+        <w:spacing w:after="120" w:line="360" w:lineRule="auto"/>
+        <w:jc w:val="both"/>
+      </w:pPr>
+      <w:r>
+        <w:rPr>
+          <w:rFonts w:ascii="David" w:cs="David" w:eastAsia="David" w:hAnsi="David"/>
+          <w:noProof/>
+          <w:b/>
+          <w:bCs/>
+          <w:sz w:val="24"/>
+          <w:szCs w:val="24"/>
+          <w:rtl/>
+        </w:rPr>
+        <w:t xml:space="preserve">נור: </w:t>
+      </w:r>
+      <w:r>
+        <w:rPr>
+          <w:rFonts w:ascii="David" w:cs="David" w:eastAsia="David" w:hAnsi="David"/>
+          <w:noProof/>
+          <w:sz w:val="24"/>
+          <w:szCs w:val="24"/>
+          <w:rtl/>
+        </w:rPr>
+        <w:t xml:space="preserve">פתחתי את העסק בשנת 2002 כשהייתי בת שלושים. המשפחה תמכה בי. כולם תמכו בי ובאחותי ועמדו לצידנו.</w:t>
+      </w:r>
+    </w:p>
+    <w:p>
+      <w:pPr>
+        <w:bidi/>
+        <w:spacing w:after="120" w:line="360" w:lineRule="auto"/>
+        <w:jc w:val="both"/>
+      </w:pPr>
+      <w:r>
+        <w:rPr>
+          <w:rFonts w:ascii="David" w:cs="David" w:eastAsia="David" w:hAnsi="David"/>
+          <w:noProof/>
+          <w:b/>
+          <w:bCs/>
+          <w:sz w:val="24"/>
+          <w:szCs w:val="24"/>
+          <w:rtl/>
+        </w:rPr>
+        <w:t xml:space="preserve">מראיינת: </w:t>
+      </w:r>
+      <w:r>
+        <w:rPr>
+          <w:rFonts w:ascii="David" w:cs="David" w:eastAsia="David" w:hAnsi="David"/>
+          <w:noProof/>
+          <w:sz w:val="24"/>
+          <w:szCs w:val="24"/>
+          <w:rtl/>
+        </w:rPr>
+        <w:t xml:space="preserve">התמיכה הזאת הייתה חשובה לך בתחילת הדרך?</w:t>
+      </w:r>
+    </w:p>
+    <w:p>
+      <w:pPr>
+        <w:bidi/>
+        <w:spacing w:after="120" w:line="360" w:lineRule="auto"/>
+        <w:jc w:val="both"/>
+      </w:pPr>
+      <w:r>
+        <w:rPr>
+          <w:rFonts w:ascii="David" w:cs="David" w:eastAsia="David" w:hAnsi="David"/>
+          <w:noProof/>
+          <w:b/>
+          <w:bCs/>
+          <w:sz w:val="24"/>
+          <w:szCs w:val="24"/>
+          <w:rtl/>
+        </w:rPr>
+        <w:t xml:space="preserve">נור: </w:t>
+      </w:r>
+      <w:r>
+        <w:rPr>
+          <w:rFonts w:ascii="David" w:cs="David" w:eastAsia="David" w:hAnsi="David"/>
+          <w:noProof/>
+          <w:sz w:val="24"/>
+          <w:szCs w:val="24"/>
+          <w:rtl/>
+        </w:rPr>
+        <w:t xml:space="preserve">כולם תמכו בי ובאחותי ועמדו לצידנו.</w:t>
+      </w:r>
+    </w:p>
+    <w:p>
+      <w:pPr>
+        <w:bidi/>
+        <w:spacing w:after="120" w:line="360" w:lineRule="auto"/>
+        <w:jc w:val="both"/>
+      </w:pPr>
+      <w:r>
+        <w:rPr>
+          <w:rFonts w:ascii="David" w:cs="David" w:eastAsia="David" w:hAnsi="David"/>
+          <w:noProof/>
+          <w:b/>
+          <w:bCs/>
+          <w:sz w:val="24"/>
+          <w:szCs w:val="24"/>
+          <w:rtl/>
+        </w:rPr>
+        <w:t xml:space="preserve">מראיינת: </w:t>
+      </w:r>
+      <w:r>
+        <w:rPr>
+          <w:rFonts w:ascii="David" w:cs="David" w:eastAsia="David" w:hAnsi="David"/>
+          <w:noProof/>
+          <w:sz w:val="24"/>
+          <w:szCs w:val="24"/>
+          <w:rtl/>
+        </w:rPr>
+        <w:t xml:space="preserve">האם נעזרת גם בקשרים החברתיים שלך כדי למשוך לקוחות?</w:t>
+      </w:r>
+    </w:p>
+    <w:p>
+      <w:pPr>
+        <w:bidi/>
+        <w:spacing w:after="120" w:line="360" w:lineRule="auto"/>
+        <w:jc w:val="both"/>
+      </w:pPr>
+      <w:r>
+        <w:rPr>
+          <w:rFonts w:ascii="David" w:cs="David" w:eastAsia="David" w:hAnsi="David"/>
+          <w:noProof/>
+          <w:b/>
+          <w:bCs/>
+          <w:sz w:val="24"/>
+          <w:szCs w:val="24"/>
+          <w:rtl/>
+        </w:rPr>
+        <w:t xml:space="preserve">נור: </w:t>
+      </w:r>
+      <w:r>
+        <w:rPr>
+          <w:rFonts w:ascii="David" w:cs="David" w:eastAsia="David" w:hAnsi="David"/>
+          <w:noProof/>
+          <w:sz w:val="24"/>
+          <w:szCs w:val="24"/>
+          <w:rtl/>
+        </w:rPr>
+        <w:t xml:space="preserve">כמובן. בעבודה הזאת חשוב לדעת לדבר עם אנשים ולהתייחס אליהם בצורה טובה. אם את לא יודעת לדבר ולהתנהל עם אנשים, הם לא ירצו להיכנס אלייך.</w:t>
+      </w:r>
+    </w:p>
+    <w:p>
+      <w:pPr>
+        <w:bidi/>
+        <w:spacing w:after="120" w:line="360" w:lineRule="auto"/>
+        <w:jc w:val="both"/>
+      </w:pPr>
+      <w:r>
+        <w:rPr>
+          <w:rFonts w:ascii="David" w:cs="David" w:eastAsia="David" w:hAnsi="David"/>
+          <w:noProof/>
+          <w:b/>
+          <w:bCs/>
+          <w:sz w:val="24"/>
+          <w:szCs w:val="24"/>
+          <w:rtl/>
+        </w:rPr>
+        <w:t xml:space="preserve">מראיינת: </w:t>
+      </w:r>
+      <w:r>
+        <w:rPr>
+          <w:rFonts w:ascii="David" w:cs="David" w:eastAsia="David" w:hAnsi="David"/>
+          <w:noProof/>
+          <w:sz w:val="24"/>
+          <w:szCs w:val="24"/>
+          <w:rtl/>
+        </w:rPr>
+        <w:t xml:space="preserve">כלומר, מבחינתך היחס ללקוחות הוא חלק חשוב מההצלחה של העסק?</w:t>
+      </w:r>
+    </w:p>
+    <w:p>
+      <w:pPr>
+        <w:bidi/>
+        <w:spacing w:after="120" w:line="360" w:lineRule="auto"/>
+        <w:jc w:val="both"/>
+      </w:pPr>
+      <w:r>
+        <w:rPr>
+          <w:rFonts w:ascii="David" w:cs="David" w:eastAsia="David" w:hAnsi="David"/>
+          <w:noProof/>
+          <w:b/>
+          <w:bCs/>
+          <w:sz w:val="24"/>
+          <w:szCs w:val="24"/>
+          <w:rtl/>
+        </w:rPr>
+        <w:t xml:space="preserve">נור: </w:t>
+      </w:r>
+      <w:r>
+        <w:rPr>
+          <w:rFonts w:ascii="David" w:cs="David" w:eastAsia="David" w:hAnsi="David"/>
+          <w:noProof/>
+          <w:sz w:val="24"/>
+          <w:szCs w:val="24"/>
+          <w:rtl/>
+        </w:rPr>
+        <w:t xml:space="preserve">חשוב לדעת לדבר עם אנשים ולהתייחס אליהם בצורה טובה.</w:t>
+      </w:r>
+    </w:p>
+    <w:p>
+      <w:pPr>
+        <w:bidi/>
+        <w:spacing w:after="120" w:line="360" w:lineRule="auto"/>
+        <w:jc w:val="both"/>
+      </w:pPr>
+      <w:r>
+        <w:rPr>
+          <w:rFonts w:ascii="David" w:cs="David" w:eastAsia="David" w:hAnsi="David"/>
+          <w:noProof/>
+          <w:b/>
+          <w:bCs/>
+          <w:sz w:val="24"/>
+          <w:szCs w:val="24"/>
+          <w:rtl/>
+        </w:rPr>
+        <w:t xml:space="preserve">מראיינת: </w:t>
+      </w:r>
+      <w:r>
+        <w:rPr>
+          <w:rFonts w:ascii="David" w:cs="David" w:eastAsia="David" w:hAnsi="David"/>
+          <w:noProof/>
+          <w:sz w:val="24"/>
+          <w:szCs w:val="24"/>
+          <w:rtl/>
+        </w:rPr>
+        <w:t xml:space="preserve">האם נתקלת במהלך הדרך בביקורת או בקשיים מצד החברה?</w:t>
+      </w:r>
+    </w:p>
+    <w:p>
+      <w:pPr>
+        <w:bidi/>
+        <w:spacing w:after="120" w:line="360" w:lineRule="auto"/>
+        <w:jc w:val="both"/>
+      </w:pPr>
+      <w:r>
+        <w:rPr>
+          <w:rFonts w:ascii="David" w:cs="David" w:eastAsia="David" w:hAnsi="David"/>
+          <w:noProof/>
+          <w:b/>
+          <w:bCs/>
+          <w:sz w:val="24"/>
+          <w:szCs w:val="24"/>
+          <w:rtl/>
+        </w:rPr>
+        <w:t xml:space="preserve">נור: </w:t>
+      </w:r>
+      <w:r>
+        <w:rPr>
+          <w:rFonts w:ascii="David" w:cs="David" w:eastAsia="David" w:hAnsi="David"/>
+          <w:noProof/>
+          <w:sz w:val="24"/>
+          <w:szCs w:val="24"/>
+          <w:rtl/>
+        </w:rPr>
+        <w:t xml:space="preserve">בהתחלה כן. היו אנשים שדיברו והעבירו ביקורת. אני זוכרת מקרה שבו לקוחה ביקשה מידה מסוימת ולא הייתה המידה שהיא רצתה. כנראה שזה לא מצא חן בעיניה ואחר כך הגיע אליי שהיא דיברה עליי.</w:t>
+      </w:r>
+    </w:p>
+    <w:p>
+      <w:pPr>
+        <w:bidi/>
+        <w:spacing w:after="120" w:line="360" w:lineRule="auto"/>
+        <w:jc w:val="both"/>
+      </w:pPr>
+      <w:r>
+        <w:rPr>
+          <w:rFonts w:ascii="David" w:cs="David" w:eastAsia="David" w:hAnsi="David"/>
+          <w:noProof/>
+          <w:b/>
+          <w:bCs/>
+          <w:sz w:val="24"/>
+          <w:szCs w:val="24"/>
+          <w:rtl/>
+        </w:rPr>
+        <w:t xml:space="preserve">מראיינת: </w:t>
+      </w:r>
+      <w:r>
+        <w:rPr>
+          <w:rFonts w:ascii="David" w:cs="David" w:eastAsia="David" w:hAnsi="David"/>
+          <w:noProof/>
+          <w:sz w:val="24"/>
+          <w:szCs w:val="24"/>
+          <w:rtl/>
+        </w:rPr>
+        <w:t xml:space="preserve">ואיך התמודדת עם זה כששמעת שהיא דיברה עלייך?</w:t>
+      </w:r>
+    </w:p>
+    <w:p>
+      <w:pPr>
+        <w:bidi/>
+        <w:spacing w:after="120" w:line="360" w:lineRule="auto"/>
+        <w:jc w:val="both"/>
+      </w:pPr>
+      <w:r>
+        <w:rPr>
+          <w:rFonts w:ascii="David" w:cs="David" w:eastAsia="David" w:hAnsi="David"/>
+          <w:noProof/>
+          <w:b/>
+          <w:bCs/>
+          <w:sz w:val="24"/>
+          <w:szCs w:val="24"/>
+          <w:rtl/>
+        </w:rPr>
+        <w:t xml:space="preserve">נור: </w:t>
+      </w:r>
+      <w:r>
+        <w:rPr>
+          <w:rFonts w:ascii="David" w:cs="David" w:eastAsia="David" w:hAnsi="David"/>
+          <w:noProof/>
+          <w:sz w:val="24"/>
+          <w:szCs w:val="24"/>
+          <w:rtl/>
+        </w:rPr>
+        <w:t xml:space="preserve">שמעתי שהיא דיברה, אבל לא התייחסתי לזה.</w:t>
+      </w:r>
+    </w:p>
+    <w:p>
+      <w:pPr>
+        <w:bidi/>
+        <w:spacing w:after="120" w:line="360" w:lineRule="auto"/>
+        <w:jc w:val="both"/>
+      </w:pPr>
+      <w:r>
+        <w:rPr>
+          <w:rFonts w:ascii="David" w:cs="David" w:eastAsia="David" w:hAnsi="David"/>
+          <w:noProof/>
+          <w:b/>
+          <w:bCs/>
+          <w:sz w:val="24"/>
+          <w:szCs w:val="24"/>
+          <w:rtl/>
+        </w:rPr>
+        <w:t xml:space="preserve">מראיינת: </w:t>
+      </w:r>
+      <w:r>
+        <w:rPr>
+          <w:rFonts w:ascii="David" w:cs="David" w:eastAsia="David" w:hAnsi="David"/>
+          <w:noProof/>
+          <w:sz w:val="24"/>
+          <w:szCs w:val="24"/>
+          <w:rtl/>
+        </w:rPr>
+        <w:t xml:space="preserve">והמשכת בעסק למרות הביקורת?</w:t>
+      </w:r>
+    </w:p>
+    <w:p>
+      <w:pPr>
+        <w:bidi/>
+        <w:spacing w:after="120" w:line="360" w:lineRule="auto"/>
+        <w:jc w:val="both"/>
+      </w:pPr>
+      <w:r>
+        <w:rPr>
+          <w:rFonts w:ascii="David" w:cs="David" w:eastAsia="David" w:hAnsi="David"/>
+          <w:noProof/>
+          <w:b/>
+          <w:bCs/>
+          <w:sz w:val="24"/>
+          <w:szCs w:val="24"/>
+          <w:rtl/>
+        </w:rPr>
+        <w:t xml:space="preserve">נור: </w:t>
+      </w:r>
+      <w:r>
+        <w:rPr>
+          <w:rFonts w:ascii="David" w:cs="David" w:eastAsia="David" w:hAnsi="David"/>
+          <w:noProof/>
+          <w:sz w:val="24"/>
+          <w:szCs w:val="24"/>
+          <w:rtl/>
+        </w:rPr>
+        <w:t xml:space="preserve">המשכתי, כמובן.</w:t>
       </w:r>
     </w:p>
     <w:p>
       <w:pPr>
         <w:bidi/>
         <w:spacing w:after="60" w:before="160" w:line="360" w:lineRule="auto"/>
-        <w:jc w:val="both"/>
-      </w:pPr>
-      <w:r>
-        <w:rPr>
-          <w:rFonts w:ascii="David" w:cs="David" w:eastAsia="David" w:hAnsi="David"/>
-          <w:noProof/>
-          <w:b/>
-          <w:bCs/>
-          <w:sz w:val="24"/>
-          <w:szCs w:val="24"/>
-          <w:rtl/>
-        </w:rPr>
-        <w:t xml:space="preserve">3. איך למדת את העבודה בלי לימודים? מי עזר לך? תני דוגמה לטעות שלמדת ממנה.</w:t>
-      </w:r>
-    </w:p>
-    <w:p>
-      <w:pPr>
-        <w:bidi/>
-        <w:spacing w:after="120" w:line="360" w:lineRule="auto"/>
-        <w:jc w:val="both"/>
-      </w:pPr>
-      <w:r>
-        <w:rPr>
-          <w:rFonts w:ascii="David" w:cs="David" w:eastAsia="David" w:hAnsi="David"/>
-          <w:noProof/>
-          <w:sz w:val="24"/>
-          <w:szCs w:val="24"/>
-          <w:rtl/>
-        </w:rPr>
-        <w:t xml:space="preserve">למדתי בעיקר מהניסיון ומהדברים שעברתי במהלך העבודה. בשנה הראשונה היה לי קשה מאוד, במיוחד בחישובים. לא היה לי ניסיון קודם בדברים האלה: כמה עולה, כמה מוכרים, מה נשאר אחרי שמשלמים לספק ולחנות. בעלה של אחותי עזר לנו קצת, הוא היה יושב איתנו בערב ומסדר את המספרים, ועם הזמן, אחרי שנכנסנו יותר לתוך העבודה וצברנו ניסיון, זה הפך להיות רגיל וקל יותר. טעויות היו הרבה. למשל, לפעמים עושים טעות בחישוב, או קונים סחורה ואחר כך מגלים שהיא לא נמכרת כמו שציפינו, ואז הכסף יושב על המדף. היום אפשר לפרסם דברים באינסטגרם וברשתות, אבל בזמננו הדברים האלה לא היו קיימים, אז הכול למדנו מהלקוחות עצמן: מה הן לוקחות ומה הן מחזירות. גם העברית הייתה קושי. כשהייתי צעירה כמעט לא ידעתי עברית, וכשצריך לדבר עם ספקים בתל אביב זה היה קשה מאוד, אבל עם הזמן למדתי להסתדר. ולמדתי את הדבר הכי חשוב בעבודה הזאת: חשוב לדעת לדבר עם אנשים ולהתייחס אליהם בצורה טובה. אם את לא יודעת לדבר ולהתנהל עם אנשים, הם לא ירצו להיכנס אלייך.</w:t>
+        <w:jc w:val="right"/>
+      </w:pPr>
+      <w:r>
+        <w:rPr>
+          <w:rFonts w:ascii="David" w:cs="David" w:eastAsia="David" w:hAnsi="David"/>
+          <w:noProof/>
+          <w:b/>
+          <w:bCs/>
+          <w:sz w:val="24"/>
+          <w:szCs w:val="24"/>
+          <w:rtl/>
+        </w:rPr>
+        <w:t xml:space="preserve">שילוב בין העסק, הבית והמשפחה</w:t>
+      </w:r>
+    </w:p>
+    <w:p>
+      <w:pPr>
+        <w:bidi/>
+        <w:spacing w:after="120" w:line="360" w:lineRule="auto"/>
+        <w:jc w:val="both"/>
+      </w:pPr>
+      <w:r>
+        <w:rPr>
+          <w:rFonts w:ascii="David" w:cs="David" w:eastAsia="David" w:hAnsi="David"/>
+          <w:noProof/>
+          <w:b/>
+          <w:bCs/>
+          <w:sz w:val="24"/>
+          <w:szCs w:val="24"/>
+          <w:rtl/>
+        </w:rPr>
+        <w:t xml:space="preserve">מראיינת: </w:t>
+      </w:r>
+      <w:r>
+        <w:rPr>
+          <w:rFonts w:ascii="David" w:cs="David" w:eastAsia="David" w:hAnsi="David"/>
+          <w:noProof/>
+          <w:sz w:val="24"/>
+          <w:szCs w:val="24"/>
+          <w:rtl/>
+        </w:rPr>
+        <w:t xml:space="preserve">מה היו האתגרים המרכזיים שהתמודדת איתם כאישה שעובדת בתחום הזה? למשל, השילוב בין העסק לבין הבית והמשפחה.</w:t>
+      </w:r>
+    </w:p>
+    <w:p>
+      <w:pPr>
+        <w:bidi/>
+        <w:spacing w:after="120" w:line="360" w:lineRule="auto"/>
+        <w:jc w:val="both"/>
+      </w:pPr>
+      <w:r>
+        <w:rPr>
+          <w:rFonts w:ascii="David" w:cs="David" w:eastAsia="David" w:hAnsi="David"/>
+          <w:noProof/>
+          <w:b/>
+          <w:bCs/>
+          <w:sz w:val="24"/>
+          <w:szCs w:val="24"/>
+          <w:rtl/>
+        </w:rPr>
+        <w:t xml:space="preserve">נור: </w:t>
+      </w:r>
+      <w:r>
+        <w:rPr>
+          <w:rFonts w:ascii="David" w:cs="David" w:eastAsia="David" w:hAnsi="David"/>
+          <w:noProof/>
+          <w:sz w:val="24"/>
+          <w:szCs w:val="24"/>
+          <w:rtl/>
+        </w:rPr>
+        <w:t xml:space="preserve">הייתה תקופה שבה היה לבעלי קשה עם זה, במיוחד בתקופות שבהן הייתי הרבה בעסק. נוצרו בינינו לפעמים בעיות כי הוא הרגיש שאני מתעניינת בחנות יותר. אבל בהמשך, ברוך השם, הוא הבין אותי.</w:t>
+      </w:r>
+    </w:p>
+    <w:p>
+      <w:pPr>
+        <w:bidi/>
+        <w:spacing w:after="120" w:line="360" w:lineRule="auto"/>
+        <w:jc w:val="both"/>
+      </w:pPr>
+      <w:r>
+        <w:rPr>
+          <w:rFonts w:ascii="David" w:cs="David" w:eastAsia="David" w:hAnsi="David"/>
+          <w:noProof/>
+          <w:b/>
+          <w:bCs/>
+          <w:sz w:val="24"/>
+          <w:szCs w:val="24"/>
+          <w:rtl/>
+        </w:rPr>
+        <w:t xml:space="preserve">מראיינת: </w:t>
+      </w:r>
+      <w:r>
+        <w:rPr>
+          <w:rFonts w:ascii="David" w:cs="David" w:eastAsia="David" w:hAnsi="David"/>
+          <w:noProof/>
+          <w:sz w:val="24"/>
+          <w:szCs w:val="24"/>
+          <w:rtl/>
+        </w:rPr>
+        <w:t xml:space="preserve">כלומר, בתחילת הדרך היה קושי מסוים, אבל בהמשך היחס שלו השתנה?</w:t>
+      </w:r>
+    </w:p>
+    <w:p>
+      <w:pPr>
+        <w:bidi/>
+        <w:spacing w:after="120" w:line="360" w:lineRule="auto"/>
+        <w:jc w:val="both"/>
+      </w:pPr>
+      <w:r>
+        <w:rPr>
+          <w:rFonts w:ascii="David" w:cs="David" w:eastAsia="David" w:hAnsi="David"/>
+          <w:noProof/>
+          <w:b/>
+          <w:bCs/>
+          <w:sz w:val="24"/>
+          <w:szCs w:val="24"/>
+          <w:rtl/>
+        </w:rPr>
+        <w:t xml:space="preserve">נור: </w:t>
+      </w:r>
+      <w:r>
+        <w:rPr>
+          <w:rFonts w:ascii="David" w:cs="David" w:eastAsia="David" w:hAnsi="David"/>
+          <w:noProof/>
+          <w:sz w:val="24"/>
+          <w:szCs w:val="24"/>
+          <w:rtl/>
+        </w:rPr>
+        <w:t xml:space="preserve">כן. בהמשך, ברוך השם, הוא הבין אותי.</w:t>
+      </w:r>
+    </w:p>
+    <w:p>
+      <w:pPr>
+        <w:bidi/>
+        <w:spacing w:after="120" w:line="360" w:lineRule="auto"/>
+        <w:jc w:val="both"/>
+      </w:pPr>
+      <w:r>
+        <w:rPr>
+          <w:rFonts w:ascii="David" w:cs="David" w:eastAsia="David" w:hAnsi="David"/>
+          <w:noProof/>
+          <w:b/>
+          <w:bCs/>
+          <w:sz w:val="24"/>
+          <w:szCs w:val="24"/>
+          <w:rtl/>
+        </w:rPr>
+        <w:t xml:space="preserve">מראיינת: </w:t>
+      </w:r>
+      <w:r>
+        <w:rPr>
+          <w:rFonts w:ascii="David" w:cs="David" w:eastAsia="David" w:hAnsi="David"/>
+          <w:noProof/>
+          <w:sz w:val="24"/>
+          <w:szCs w:val="24"/>
+          <w:rtl/>
+        </w:rPr>
+        <w:t xml:space="preserve">האם היו לך קשיים של תחבורה או נסיעות לעבודה?</w:t>
+      </w:r>
+    </w:p>
+    <w:p>
+      <w:pPr>
+        <w:bidi/>
+        <w:spacing w:after="120" w:line="360" w:lineRule="auto"/>
+        <w:jc w:val="both"/>
+      </w:pPr>
+      <w:r>
+        <w:rPr>
+          <w:rFonts w:ascii="David" w:cs="David" w:eastAsia="David" w:hAnsi="David"/>
+          <w:noProof/>
+          <w:b/>
+          <w:bCs/>
+          <w:sz w:val="24"/>
+          <w:szCs w:val="24"/>
+          <w:rtl/>
+        </w:rPr>
+        <w:t xml:space="preserve">נור: </w:t>
+      </w:r>
+      <w:r>
+        <w:rPr>
+          <w:rFonts w:ascii="David" w:cs="David" w:eastAsia="David" w:hAnsi="David"/>
+          <w:noProof/>
+          <w:sz w:val="24"/>
+          <w:szCs w:val="24"/>
+          <w:rtl/>
+        </w:rPr>
+        <w:t xml:space="preserve">לא כל כך, כי החנות הייתה קרובה לבית. אני גם גרה אחרי הנישואים ליד בית ההורים שלי, ולכן מבחינת המרחק לא הייתה בעיה גדולה.</w:t>
+      </w:r>
+    </w:p>
+    <w:p>
+      <w:pPr>
+        <w:bidi/>
+        <w:spacing w:after="120" w:line="360" w:lineRule="auto"/>
+        <w:jc w:val="both"/>
+      </w:pPr>
+      <w:r>
+        <w:rPr>
+          <w:rFonts w:ascii="David" w:cs="David" w:eastAsia="David" w:hAnsi="David"/>
+          <w:noProof/>
+          <w:b/>
+          <w:bCs/>
+          <w:sz w:val="24"/>
+          <w:szCs w:val="24"/>
+          <w:rtl/>
+        </w:rPr>
+        <w:t xml:space="preserve">מראיינת: </w:t>
+      </w:r>
+      <w:r>
+        <w:rPr>
+          <w:rFonts w:ascii="David" w:cs="David" w:eastAsia="David" w:hAnsi="David"/>
+          <w:noProof/>
+          <w:sz w:val="24"/>
+          <w:szCs w:val="24"/>
+          <w:rtl/>
+        </w:rPr>
+        <w:t xml:space="preserve">ומה עשית כשהיית צריכה להביא סחורה מתל אביב?</w:t>
+      </w:r>
+    </w:p>
+    <w:p>
+      <w:pPr>
+        <w:bidi/>
+        <w:spacing w:after="120" w:line="360" w:lineRule="auto"/>
+        <w:jc w:val="both"/>
+      </w:pPr>
+      <w:r>
+        <w:rPr>
+          <w:rFonts w:ascii="David" w:cs="David" w:eastAsia="David" w:hAnsi="David"/>
+          <w:noProof/>
+          <w:b/>
+          <w:bCs/>
+          <w:sz w:val="24"/>
+          <w:szCs w:val="24"/>
+          <w:rtl/>
+        </w:rPr>
+        <w:t xml:space="preserve">נור: </w:t>
+      </w:r>
+      <w:r>
+        <w:rPr>
+          <w:rFonts w:ascii="David" w:cs="David" w:eastAsia="David" w:hAnsi="David"/>
+          <w:noProof/>
+          <w:sz w:val="24"/>
+          <w:szCs w:val="24"/>
+          <w:rtl/>
+        </w:rPr>
+        <w:t xml:space="preserve">אחותי ובעלי היו נוסעים ועוזרים לי. בעלי עזר לנו הרבה, שאלוהים ישמור עליו.</w:t>
+      </w:r>
+    </w:p>
+    <w:p>
+      <w:pPr>
+        <w:bidi/>
+        <w:spacing w:after="120" w:line="360" w:lineRule="auto"/>
+        <w:jc w:val="both"/>
+      </w:pPr>
+      <w:r>
+        <w:rPr>
+          <w:rFonts w:ascii="David" w:cs="David" w:eastAsia="David" w:hAnsi="David"/>
+          <w:noProof/>
+          <w:b/>
+          <w:bCs/>
+          <w:sz w:val="24"/>
+          <w:szCs w:val="24"/>
+          <w:rtl/>
+        </w:rPr>
+        <w:t xml:space="preserve">מראיינת: </w:t>
+      </w:r>
+      <w:r>
+        <w:rPr>
+          <w:rFonts w:ascii="David" w:cs="David" w:eastAsia="David" w:hAnsi="David"/>
+          <w:noProof/>
+          <w:sz w:val="24"/>
+          <w:szCs w:val="24"/>
+          <w:rtl/>
+        </w:rPr>
+        <w:t xml:space="preserve">איך בעלך תמך בך לאורך הדרך? האם הרגשת שהוא מאמין בך ובעסק?</w:t>
+      </w:r>
+    </w:p>
+    <w:p>
+      <w:pPr>
+        <w:bidi/>
+        <w:spacing w:after="120" w:line="360" w:lineRule="auto"/>
+        <w:jc w:val="both"/>
+      </w:pPr>
+      <w:r>
+        <w:rPr>
+          <w:rFonts w:ascii="David" w:cs="David" w:eastAsia="David" w:hAnsi="David"/>
+          <w:noProof/>
+          <w:b/>
+          <w:bCs/>
+          <w:sz w:val="24"/>
+          <w:szCs w:val="24"/>
+          <w:rtl/>
+        </w:rPr>
+        <w:t xml:space="preserve">נור: </w:t>
+      </w:r>
+      <w:r>
+        <w:rPr>
+          <w:rFonts w:ascii="David" w:cs="David" w:eastAsia="David" w:hAnsi="David"/>
+          <w:noProof/>
+          <w:sz w:val="24"/>
+          <w:szCs w:val="24"/>
+          <w:rtl/>
+        </w:rPr>
+        <w:t xml:space="preserve">כמובן. הוא תמך בי ועד היום הוא תומך בי. הוא האמין בי. אם הוא לא היה מאמין בי, לא היינו ממשיכים יחד עד היום. הוא עזר לי הרבה, שאלוהים ישמח אותו.</w:t>
       </w:r>
     </w:p>
     <w:p>
       <w:pPr>
         <w:bidi/>
         <w:spacing w:after="60" w:before="160" w:line="360" w:lineRule="auto"/>
-        <w:jc w:val="both"/>
-      </w:pPr>
-      <w:r>
-        <w:rPr>
-          <w:rFonts w:ascii="David" w:cs="David" w:eastAsia="David" w:hAnsi="David"/>
-          <w:noProof/>
-          <w:b/>
-          <w:bCs/>
-          <w:sz w:val="24"/>
-          <w:szCs w:val="24"/>
-          <w:rtl/>
-        </w:rPr>
-        <w:t xml:space="preserve">4. איך המשפחה ובן הזוג הגיבו? האם זה השתנה עם הזמן?</w:t>
-      </w:r>
-    </w:p>
-    <w:p>
-      <w:pPr>
-        <w:bidi/>
-        <w:spacing w:after="120" w:line="360" w:lineRule="auto"/>
-        <w:jc w:val="both"/>
-      </w:pPr>
-      <w:r>
-        <w:rPr>
-          <w:rFonts w:ascii="David" w:cs="David" w:eastAsia="David" w:hAnsi="David"/>
-          <w:noProof/>
-          <w:sz w:val="24"/>
-          <w:szCs w:val="24"/>
-          <w:rtl/>
-        </w:rPr>
-        <w:t xml:space="preserve">המשפחה תמכה בי. כולם תמכו בי ובאחותי ועמדו לצידנו, ההורים, האחים, כולם. זה שאני גרה ליד בית ההורים עזר מאוד, כי החנות הייתה קרובה לבית, ומבחינת המרחק לא הייתה בעיה גדולה, לא הייתי צריכה נסיעות ולא מישהו שישמור על הילדים רחוק. עם בעלי זה היה יותר מורכב. הוא לא התנגד לחנות עצמה, אבל הייתה תקופה שבה היה לבעלי קשה עם זה, במיוחד בתקופות שבהן הייתי הרבה בעסק. נוצרו בינינו לפעמים בעיות, כי הוא הרגיש שאני מתעניינת בחנות יותר מאשר בבית ובו. היו ערבים של שתיקה. אבל בהמשך, ברוך השם, הוא הבין אותי. הוא ראה שהחנות לא לוקחת אותי מהמשפחה אלא עוזרת למשפחה. ומאז הוא תמך בי ועד היום הוא תומך בי. כשהיינו צריכות סחורה מתל אביב, אחותי ובעלי היו נוסעים ועוזרים לי, הוא היה לוקח את האוטו, מחכה להן בשוק, סוחב את השקיות. בעלי עזר לנו הרבה, שאלוהים ישמור עליו. הוא האמין בי. אם הוא לא היה מאמין בי, לא היינו ממשיכים יחד עד היום.</w:t>
+        <w:jc w:val="right"/>
+      </w:pPr>
+      <w:r>
+        <w:rPr>
+          <w:rFonts w:ascii="David" w:cs="David" w:eastAsia="David" w:hAnsi="David"/>
+          <w:noProof/>
+          <w:b/>
+          <w:bCs/>
+          <w:sz w:val="24"/>
+          <w:szCs w:val="24"/>
+          <w:rtl/>
+        </w:rPr>
+        <w:t xml:space="preserve">קשיים, התמדה והתפתחות אישית</w:t>
+      </w:r>
+    </w:p>
+    <w:p>
+      <w:pPr>
+        <w:bidi/>
+        <w:spacing w:after="120" w:line="360" w:lineRule="auto"/>
+        <w:jc w:val="both"/>
+      </w:pPr>
+      <w:r>
+        <w:rPr>
+          <w:rFonts w:ascii="David" w:cs="David" w:eastAsia="David" w:hAnsi="David"/>
+          <w:noProof/>
+          <w:b/>
+          <w:bCs/>
+          <w:sz w:val="24"/>
+          <w:szCs w:val="24"/>
+          <w:rtl/>
+        </w:rPr>
+        <w:t xml:space="preserve">מראיינת: </w:t>
+      </w:r>
+      <w:r>
+        <w:rPr>
+          <w:rFonts w:ascii="David" w:cs="David" w:eastAsia="David" w:hAnsi="David"/>
+          <w:noProof/>
+          <w:sz w:val="24"/>
+          <w:szCs w:val="24"/>
+          <w:rtl/>
+        </w:rPr>
+        <w:t xml:space="preserve">אחרי כל השנים האלה בעסק, האם הייתה תקופה קשה במיוחד שאת זוכרת?</w:t>
+      </w:r>
+    </w:p>
+    <w:p>
+      <w:pPr>
+        <w:bidi/>
+        <w:spacing w:after="120" w:line="360" w:lineRule="auto"/>
+        <w:jc w:val="both"/>
+      </w:pPr>
+      <w:r>
+        <w:rPr>
+          <w:rFonts w:ascii="David" w:cs="David" w:eastAsia="David" w:hAnsi="David"/>
+          <w:noProof/>
+          <w:b/>
+          <w:bCs/>
+          <w:sz w:val="24"/>
+          <w:szCs w:val="24"/>
+          <w:rtl/>
+        </w:rPr>
+        <w:t xml:space="preserve">נור: </w:t>
+      </w:r>
+      <w:r>
+        <w:rPr>
+          <w:rFonts w:ascii="David" w:cs="David" w:eastAsia="David" w:hAnsi="David"/>
+          <w:noProof/>
+          <w:sz w:val="24"/>
+          <w:szCs w:val="24"/>
+          <w:rtl/>
+        </w:rPr>
+        <w:t xml:space="preserve">בעסק יש הרבה דברים קשים שאדם עובר. למשל, בתקופות שאין חגים או אירועים, לפעמים אין מספיק עבודה. את עומדת בחנות ויש לך במקביל בית, הוצאות וילדים, ואז מרגישים את הקושי.</w:t>
+      </w:r>
+    </w:p>
+    <w:p>
+      <w:pPr>
+        <w:bidi/>
+        <w:spacing w:after="120" w:line="360" w:lineRule="auto"/>
+        <w:jc w:val="both"/>
+      </w:pPr>
+      <w:r>
+        <w:rPr>
+          <w:rFonts w:ascii="David" w:cs="David" w:eastAsia="David" w:hAnsi="David"/>
+          <w:noProof/>
+          <w:b/>
+          <w:bCs/>
+          <w:sz w:val="24"/>
+          <w:szCs w:val="24"/>
+          <w:rtl/>
+        </w:rPr>
+        <w:t xml:space="preserve">מראיינת: </w:t>
+      </w:r>
+      <w:r>
+        <w:rPr>
+          <w:rFonts w:ascii="David" w:cs="David" w:eastAsia="David" w:hAnsi="David"/>
+          <w:noProof/>
+          <w:sz w:val="24"/>
+          <w:szCs w:val="24"/>
+          <w:rtl/>
+        </w:rPr>
+        <w:t xml:space="preserve">ובתקופות כאלה, כשהעבודה חלשה אבל ההוצאות ממשיכות, מה נתן לך את הכוח להמשיך?</w:t>
+      </w:r>
+    </w:p>
+    <w:p>
+      <w:pPr>
+        <w:bidi/>
+        <w:spacing w:after="120" w:line="360" w:lineRule="auto"/>
+        <w:jc w:val="both"/>
+      </w:pPr>
+      <w:r>
+        <w:rPr>
+          <w:rFonts w:ascii="David" w:cs="David" w:eastAsia="David" w:hAnsi="David"/>
+          <w:noProof/>
+          <w:b/>
+          <w:bCs/>
+          <w:sz w:val="24"/>
+          <w:szCs w:val="24"/>
+          <w:rtl/>
+        </w:rPr>
+        <w:t xml:space="preserve">נור: </w:t>
+      </w:r>
+      <w:r>
+        <w:rPr>
+          <w:rFonts w:ascii="David" w:cs="David" w:eastAsia="David" w:hAnsi="David"/>
+          <w:noProof/>
+          <w:sz w:val="24"/>
+          <w:szCs w:val="24"/>
+          <w:rtl/>
+        </w:rPr>
+        <w:t xml:space="preserve">צריך סבלנות. אדם אומר לעצמו שהוא צריך לחכות ולתת לדבר לגדול. חייב להיות רצון מבפנים. כשאת מחליטה שאת רוצה לעשות משהו, את ממשיכה.</w:t>
+      </w:r>
+    </w:p>
+    <w:p>
+      <w:pPr>
+        <w:bidi/>
+        <w:spacing w:after="120" w:line="360" w:lineRule="auto"/>
+        <w:jc w:val="both"/>
+      </w:pPr>
+      <w:r>
+        <w:rPr>
+          <w:rFonts w:ascii="David" w:cs="David" w:eastAsia="David" w:hAnsi="David"/>
+          <w:noProof/>
+          <w:b/>
+          <w:bCs/>
+          <w:sz w:val="24"/>
+          <w:szCs w:val="24"/>
+          <w:rtl/>
+        </w:rPr>
+        <w:t xml:space="preserve">מראיינת: </w:t>
+      </w:r>
+      <w:r>
+        <w:rPr>
+          <w:rFonts w:ascii="David" w:cs="David" w:eastAsia="David" w:hAnsi="David"/>
+          <w:noProof/>
+          <w:sz w:val="24"/>
+          <w:szCs w:val="24"/>
+          <w:rtl/>
+        </w:rPr>
+        <w:t xml:space="preserve">כשאת מסתכלת היום על עצמך ומשווה את עצמך לאישה שהיית בתחילת הדרך, מה השתנה בך?</w:t>
+      </w:r>
+    </w:p>
+    <w:p>
+      <w:pPr>
+        <w:bidi/>
+        <w:spacing w:after="120" w:line="360" w:lineRule="auto"/>
+        <w:jc w:val="both"/>
+      </w:pPr>
+      <w:r>
+        <w:rPr>
+          <w:rFonts w:ascii="David" w:cs="David" w:eastAsia="David" w:hAnsi="David"/>
+          <w:noProof/>
+          <w:b/>
+          <w:bCs/>
+          <w:sz w:val="24"/>
+          <w:szCs w:val="24"/>
+          <w:rtl/>
+        </w:rPr>
+        <w:t xml:space="preserve">נור: </w:t>
+      </w:r>
+      <w:r>
+        <w:rPr>
+          <w:rFonts w:ascii="David" w:cs="David" w:eastAsia="David" w:hAnsi="David"/>
+          <w:noProof/>
+          <w:sz w:val="24"/>
+          <w:szCs w:val="24"/>
+          <w:rtl/>
+        </w:rPr>
+        <w:t xml:space="preserve">בעבר לא הייתי יכולה לסבול אפילו מילה. היום אני הרבה יותר סבלנית. למדתי להיות סבלנית ולדעת איך להתנהל עם אנשים. היום אני רגועה יותר.</w:t>
+      </w:r>
+    </w:p>
+    <w:p>
+      <w:pPr>
+        <w:bidi/>
+        <w:spacing w:after="120" w:line="360" w:lineRule="auto"/>
+        <w:jc w:val="both"/>
+      </w:pPr>
+      <w:r>
+        <w:rPr>
+          <w:rFonts w:ascii="David" w:cs="David" w:eastAsia="David" w:hAnsi="David"/>
+          <w:noProof/>
+          <w:b/>
+          <w:bCs/>
+          <w:sz w:val="24"/>
+          <w:szCs w:val="24"/>
+          <w:rtl/>
+        </w:rPr>
+        <w:t xml:space="preserve">מראיינת: </w:t>
+      </w:r>
+      <w:r>
+        <w:rPr>
+          <w:rFonts w:ascii="David" w:cs="David" w:eastAsia="David" w:hAnsi="David"/>
+          <w:noProof/>
+          <w:sz w:val="24"/>
+          <w:szCs w:val="24"/>
+          <w:rtl/>
+        </w:rPr>
+        <w:t xml:space="preserve">אז את מרגישה שהעבודה לא רק נתנה לך ניסיון מקצועי, אלא גם שינתה אותך באופן אישי?</w:t>
+      </w:r>
+    </w:p>
+    <w:p>
+      <w:pPr>
+        <w:bidi/>
+        <w:spacing w:after="120" w:line="360" w:lineRule="auto"/>
+        <w:jc w:val="both"/>
+      </w:pPr>
+      <w:r>
+        <w:rPr>
+          <w:rFonts w:ascii="David" w:cs="David" w:eastAsia="David" w:hAnsi="David"/>
+          <w:noProof/>
+          <w:b/>
+          <w:bCs/>
+          <w:sz w:val="24"/>
+          <w:szCs w:val="24"/>
+          <w:rtl/>
+        </w:rPr>
+        <w:t xml:space="preserve">נור: </w:t>
+      </w:r>
+      <w:r>
+        <w:rPr>
+          <w:rFonts w:ascii="David" w:cs="David" w:eastAsia="David" w:hAnsi="David"/>
+          <w:noProof/>
+          <w:sz w:val="24"/>
+          <w:szCs w:val="24"/>
+          <w:rtl/>
+        </w:rPr>
+        <w:t xml:space="preserve">למדתי להיות סבלנית ולדעת איך להתנהל עם אנשים. היום אני רגועה יותר.</w:t>
+      </w:r>
+    </w:p>
+    <w:p>
+      <w:pPr>
+        <w:bidi/>
+        <w:spacing w:after="120" w:line="360" w:lineRule="auto"/>
+        <w:jc w:val="both"/>
+      </w:pPr>
+      <w:r>
+        <w:rPr>
+          <w:rFonts w:ascii="David" w:cs="David" w:eastAsia="David" w:hAnsi="David"/>
+          <w:noProof/>
+          <w:b/>
+          <w:bCs/>
+          <w:sz w:val="24"/>
+          <w:szCs w:val="24"/>
+          <w:rtl/>
+        </w:rPr>
+        <w:t xml:space="preserve">מראיינת: </w:t>
+      </w:r>
+      <w:r>
+        <w:rPr>
+          <w:rFonts w:ascii="David" w:cs="David" w:eastAsia="David" w:hAnsi="David"/>
+          <w:noProof/>
+          <w:sz w:val="24"/>
+          <w:szCs w:val="24"/>
+          <w:rtl/>
+        </w:rPr>
+        <w:t xml:space="preserve">מהו הדבר החשוב ביותר שלמדת מכל החוויה הזאת?</w:t>
+      </w:r>
+    </w:p>
+    <w:p>
+      <w:pPr>
+        <w:bidi/>
+        <w:spacing w:after="120" w:line="360" w:lineRule="auto"/>
+        <w:jc w:val="both"/>
+      </w:pPr>
+      <w:r>
+        <w:rPr>
+          <w:rFonts w:ascii="David" w:cs="David" w:eastAsia="David" w:hAnsi="David"/>
+          <w:noProof/>
+          <w:b/>
+          <w:bCs/>
+          <w:sz w:val="24"/>
+          <w:szCs w:val="24"/>
+          <w:rtl/>
+        </w:rPr>
+        <w:t xml:space="preserve">נור: </w:t>
+      </w:r>
+      <w:r>
+        <w:rPr>
+          <w:rFonts w:ascii="David" w:cs="David" w:eastAsia="David" w:hAnsi="David"/>
+          <w:noProof/>
+          <w:sz w:val="24"/>
+          <w:szCs w:val="24"/>
+          <w:rtl/>
+        </w:rPr>
+        <w:t xml:space="preserve">הדבר הכי חשוב שלמדתי הוא סבלנות.</w:t>
+      </w:r>
+    </w:p>
+    <w:p>
+      <w:pPr>
+        <w:bidi/>
+        <w:spacing w:after="120" w:line="360" w:lineRule="auto"/>
+        <w:jc w:val="both"/>
+      </w:pPr>
+      <w:r>
+        <w:rPr>
+          <w:rFonts w:ascii="David" w:cs="David" w:eastAsia="David" w:hAnsi="David"/>
+          <w:noProof/>
+          <w:b/>
+          <w:bCs/>
+          <w:sz w:val="24"/>
+          <w:szCs w:val="24"/>
+          <w:rtl/>
+        </w:rPr>
+        <w:t xml:space="preserve">מראיינת: </w:t>
+      </w:r>
+      <w:r>
+        <w:rPr>
+          <w:rFonts w:ascii="David" w:cs="David" w:eastAsia="David" w:hAnsi="David"/>
+          <w:noProof/>
+          <w:sz w:val="24"/>
+          <w:szCs w:val="24"/>
+          <w:rtl/>
+        </w:rPr>
+        <w:t xml:space="preserve">את רואה את עצמך היום כאישה חזקה?</w:t>
+      </w:r>
+    </w:p>
+    <w:p>
+      <w:pPr>
+        <w:bidi/>
+        <w:spacing w:after="120" w:line="360" w:lineRule="auto"/>
+        <w:jc w:val="both"/>
+      </w:pPr>
+      <w:r>
+        <w:rPr>
+          <w:rFonts w:ascii="David" w:cs="David" w:eastAsia="David" w:hAnsi="David"/>
+          <w:noProof/>
+          <w:b/>
+          <w:bCs/>
+          <w:sz w:val="24"/>
+          <w:szCs w:val="24"/>
+          <w:rtl/>
+        </w:rPr>
+        <w:t xml:space="preserve">נור: </w:t>
+      </w:r>
+      <w:r>
+        <w:rPr>
+          <w:rFonts w:ascii="David" w:cs="David" w:eastAsia="David" w:hAnsi="David"/>
+          <w:noProof/>
+          <w:sz w:val="24"/>
+          <w:szCs w:val="24"/>
+          <w:rtl/>
+        </w:rPr>
+        <w:t xml:space="preserve">כמובן. אני רואה את עצמי כאישה חזקה מאוד, ברוך השם. עברתי והתמודדתי עם דברים שלא היו קלים והצלחתי להתגבר עליהם בעזרת הסבלנות, הרצון והכוח, וכמובן בעזרת אלוהים.</w:t>
       </w:r>
     </w:p>
     <w:p>
       <w:pPr>
         <w:bidi/>
         <w:spacing w:after="60" w:before="160" w:line="360" w:lineRule="auto"/>
-        <w:jc w:val="both"/>
-      </w:pPr>
-      <w:r>
-        <w:rPr>
-          <w:rFonts w:ascii="David" w:cs="David" w:eastAsia="David" w:hAnsi="David"/>
-          <w:noProof/>
-          <w:b/>
-          <w:bCs/>
-          <w:sz w:val="24"/>
-          <w:szCs w:val="24"/>
-          <w:rtl/>
-        </w:rPr>
-        <w:t xml:space="preserve">5. האם שמעת ביקורת מהסביבה? מה היה הכי קשה בדרך?</w:t>
-      </w:r>
-    </w:p>
-    <w:p>
-      <w:pPr>
-        <w:bidi/>
-        <w:spacing w:after="120" w:line="360" w:lineRule="auto"/>
-        <w:jc w:val="both"/>
-      </w:pPr>
-      <w:r>
-        <w:rPr>
-          <w:rFonts w:ascii="David" w:cs="David" w:eastAsia="David" w:hAnsi="David"/>
-          <w:noProof/>
-          <w:sz w:val="24"/>
-          <w:szCs w:val="24"/>
-          <w:rtl/>
-        </w:rPr>
-        <w:t xml:space="preserve">בהתחלה כן, היו אנשים שדיברו והעבירו ביקורת. ביישוב קטן כל דבר נשמע. אני זוכרת מקרה שבו לקוחה ביקשה מידה מסוימת ולא הייתה המידה שהיא רצתה. כנראה שזה לא מצא חן בעיניה, ואחר כך הגיע אליי שהיא דיברה עליי, שאין אצלנו כלום, שלא שווה לבוא. שמעתי שהיא דיברה, אבל לא התייחסתי לזה. המשכתי, כמובן. למדתי שמי שמתייחסת לכל מילה לא יכולה לעמוד בחנות. אבל הכי קשה בדרך לא היה הדיבורים. בעסק יש הרבה דברים קשים שאדם עובר. למשל, בתקופות שאין חגים או אירועים, לפעמים אין מספיק עבודה. את עומדת בחנות ויש לך במקביל בית, הוצאות וילדים, ואז מרגישים את הקושי. בהתחלה עברנו הרבה קשיים, היו חודשים שההפסד היה גדול מהרווח, ושכר החנות צריך לשלם בכל מקרה. וקשה היה השילוב: לקום מוקדם, לסדר את הילדים, לעמוד בחנות כל היום, לחזור ולבשל. גבר יכול לעבוד בלילה, אישה פחות, אישה צריכה להיות גם בבית. זה היה הקושי האמיתי, לא הביקורת.</w:t>
+        <w:jc w:val="right"/>
+      </w:pPr>
+      <w:r>
+        <w:rPr>
+          <w:rFonts w:ascii="David" w:cs="David" w:eastAsia="David" w:hAnsi="David"/>
+          <w:noProof/>
+          <w:b/>
+          <w:bCs/>
+          <w:sz w:val="24"/>
+          <w:szCs w:val="24"/>
+          <w:rtl/>
+        </w:rPr>
+        <w:t xml:space="preserve">משמעות ההצלחה</w:t>
+      </w:r>
+    </w:p>
+    <w:p>
+      <w:pPr>
+        <w:bidi/>
+        <w:spacing w:after="120" w:line="360" w:lineRule="auto"/>
+        <w:jc w:val="both"/>
+      </w:pPr>
+      <w:r>
+        <w:rPr>
+          <w:rFonts w:ascii="David" w:cs="David" w:eastAsia="David" w:hAnsi="David"/>
+          <w:noProof/>
+          <w:b/>
+          <w:bCs/>
+          <w:sz w:val="24"/>
+          <w:szCs w:val="24"/>
+          <w:rtl/>
+        </w:rPr>
+        <w:t xml:space="preserve">מראיינת: </w:t>
+      </w:r>
+      <w:r>
+        <w:rPr>
+          <w:rFonts w:ascii="David" w:cs="David" w:eastAsia="David" w:hAnsi="David"/>
+          <w:noProof/>
+          <w:sz w:val="24"/>
+          <w:szCs w:val="24"/>
+          <w:rtl/>
+        </w:rPr>
+        <w:t xml:space="preserve">אחרי כל הדרך שעברת, איך את מגדירה הצלחה בחיים?</w:t>
+      </w:r>
+    </w:p>
+    <w:p>
+      <w:pPr>
+        <w:bidi/>
+        <w:spacing w:after="120" w:line="360" w:lineRule="auto"/>
+        <w:jc w:val="both"/>
+      </w:pPr>
+      <w:r>
+        <w:rPr>
+          <w:rFonts w:ascii="David" w:cs="David" w:eastAsia="David" w:hAnsi="David"/>
+          <w:noProof/>
+          <w:b/>
+          <w:bCs/>
+          <w:sz w:val="24"/>
+          <w:szCs w:val="24"/>
+          <w:rtl/>
+        </w:rPr>
+        <w:t xml:space="preserve">נור: </w:t>
+      </w:r>
+      <w:r>
+        <w:rPr>
+          <w:rFonts w:ascii="David" w:cs="David" w:eastAsia="David" w:hAnsi="David"/>
+          <w:noProof/>
+          <w:sz w:val="24"/>
+          <w:szCs w:val="24"/>
+          <w:rtl/>
+        </w:rPr>
+        <w:t xml:space="preserve">רצון. צריך שיהיה לך רצון כדי להצליח. לא משנה מה קורה, אל תקשיבי לכל אחד. את צריכה להיות משוכנעת במה שאת עושה ולאהוב את מה שאת עושה כדי להצליח.</w:t>
+      </w:r>
+    </w:p>
+    <w:p>
+      <w:pPr>
+        <w:bidi/>
+        <w:spacing w:after="120" w:line="360" w:lineRule="auto"/>
+        <w:jc w:val="both"/>
+      </w:pPr>
+      <w:r>
+        <w:rPr>
+          <w:rFonts w:ascii="David" w:cs="David" w:eastAsia="David" w:hAnsi="David"/>
+          <w:noProof/>
+          <w:b/>
+          <w:bCs/>
+          <w:sz w:val="24"/>
+          <w:szCs w:val="24"/>
+          <w:rtl/>
+        </w:rPr>
+        <w:t xml:space="preserve">מראיינת: </w:t>
+      </w:r>
+      <w:r>
+        <w:rPr>
+          <w:rFonts w:ascii="David" w:cs="David" w:eastAsia="David" w:hAnsi="David"/>
+          <w:noProof/>
+          <w:sz w:val="24"/>
+          <w:szCs w:val="24"/>
+          <w:rtl/>
+        </w:rPr>
+        <w:t xml:space="preserve">מתי בדיוק פתחת את החנות?</w:t>
+      </w:r>
+    </w:p>
+    <w:p>
+      <w:pPr>
+        <w:bidi/>
+        <w:spacing w:after="120" w:line="360" w:lineRule="auto"/>
+        <w:jc w:val="both"/>
+      </w:pPr>
+      <w:r>
+        <w:rPr>
+          <w:rFonts w:ascii="David" w:cs="David" w:eastAsia="David" w:hAnsi="David"/>
+          <w:noProof/>
+          <w:b/>
+          <w:bCs/>
+          <w:sz w:val="24"/>
+          <w:szCs w:val="24"/>
+          <w:rtl/>
+        </w:rPr>
+        <w:t xml:space="preserve">נור: </w:t>
+      </w:r>
+      <w:r>
+        <w:rPr>
+          <w:rFonts w:ascii="David" w:cs="David" w:eastAsia="David" w:hAnsi="David"/>
+          <w:noProof/>
+          <w:sz w:val="24"/>
+          <w:szCs w:val="24"/>
+          <w:rtl/>
+        </w:rPr>
+        <w:t xml:space="preserve">פתחתי בשנת 2002 בחודש מרץ. אני לא אשכח את היום הזה.</w:t>
+      </w:r>
+    </w:p>
+    <w:p>
+      <w:pPr>
+        <w:bidi/>
+        <w:spacing w:after="120" w:line="360" w:lineRule="auto"/>
+        <w:jc w:val="both"/>
+      </w:pPr>
+      <w:r>
+        <w:rPr>
+          <w:rFonts w:ascii="David" w:cs="David" w:eastAsia="David" w:hAnsi="David"/>
+          <w:noProof/>
+          <w:b/>
+          <w:bCs/>
+          <w:sz w:val="24"/>
+          <w:szCs w:val="24"/>
+          <w:rtl/>
+        </w:rPr>
+        <w:t xml:space="preserve">מראיינת: </w:t>
+      </w:r>
+      <w:r>
+        <w:rPr>
+          <w:rFonts w:ascii="David" w:cs="David" w:eastAsia="David" w:hAnsi="David"/>
+          <w:noProof/>
+          <w:sz w:val="24"/>
+          <w:szCs w:val="24"/>
+          <w:rtl/>
+        </w:rPr>
+        <w:t xml:space="preserve">עברו הרבה שנים מאז. האם את מרגישה שהשגת את כל מה שרצית בחיים?</w:t>
+      </w:r>
+    </w:p>
+    <w:p>
+      <w:pPr>
+        <w:bidi/>
+        <w:spacing w:after="120" w:line="360" w:lineRule="auto"/>
+        <w:jc w:val="both"/>
+      </w:pPr>
+      <w:r>
+        <w:rPr>
+          <w:rFonts w:ascii="David" w:cs="David" w:eastAsia="David" w:hAnsi="David"/>
+          <w:noProof/>
+          <w:b/>
+          <w:bCs/>
+          <w:sz w:val="24"/>
+          <w:szCs w:val="24"/>
+          <w:rtl/>
+        </w:rPr>
+        <w:t xml:space="preserve">נור: </w:t>
+      </w:r>
+      <w:r>
+        <w:rPr>
+          <w:rFonts w:ascii="David" w:cs="David" w:eastAsia="David" w:hAnsi="David"/>
+          <w:noProof/>
+          <w:sz w:val="24"/>
+          <w:szCs w:val="24"/>
+          <w:rtl/>
+        </w:rPr>
+        <w:t xml:space="preserve">לא תמיד בן אדם מגיע למאה אחוז. אני רוצה להגיע ליותר, כמובן. בן אדם לא תמיד מסתפק במאה אחוז במה שיש לו. זאת הטבע שלנו.</w:t>
+      </w:r>
+    </w:p>
+    <w:p>
+      <w:pPr>
+        <w:bidi/>
+        <w:spacing w:after="120" w:line="360" w:lineRule="auto"/>
+        <w:jc w:val="both"/>
+      </w:pPr>
+      <w:r>
+        <w:rPr>
+          <w:rFonts w:ascii="David" w:cs="David" w:eastAsia="David" w:hAnsi="David"/>
+          <w:noProof/>
+          <w:b/>
+          <w:bCs/>
+          <w:sz w:val="24"/>
+          <w:szCs w:val="24"/>
+          <w:rtl/>
+        </w:rPr>
+        <w:t xml:space="preserve">מראיינת: </w:t>
+      </w:r>
+      <w:r>
+        <w:rPr>
+          <w:rFonts w:ascii="David" w:cs="David" w:eastAsia="David" w:hAnsi="David"/>
+          <w:noProof/>
+          <w:sz w:val="24"/>
+          <w:szCs w:val="24"/>
+          <w:rtl/>
+        </w:rPr>
+        <w:t xml:space="preserve">לדעתך, אישה יכולה להצליח גם בלי השכלה אקדמית?</w:t>
+      </w:r>
+    </w:p>
+    <w:p>
+      <w:pPr>
+        <w:bidi/>
+        <w:spacing w:after="120" w:line="360" w:lineRule="auto"/>
+        <w:jc w:val="both"/>
+      </w:pPr>
+      <w:r>
+        <w:rPr>
+          <w:rFonts w:ascii="David" w:cs="David" w:eastAsia="David" w:hAnsi="David"/>
+          <w:noProof/>
+          <w:b/>
+          <w:bCs/>
+          <w:sz w:val="24"/>
+          <w:szCs w:val="24"/>
+          <w:rtl/>
+        </w:rPr>
+        <w:t xml:space="preserve">נור: </w:t>
+      </w:r>
+      <w:r>
+        <w:rPr>
+          <w:rFonts w:ascii="David" w:cs="David" w:eastAsia="David" w:hAnsi="David"/>
+          <w:noProof/>
+          <w:sz w:val="24"/>
+          <w:szCs w:val="24"/>
+          <w:rtl/>
+        </w:rPr>
+        <w:t xml:space="preserve">כמובן. יש הרבה נשים שהצליחו. גם אצלנו יש נשים שפתחו עסקים ופרויקטים שונים והצליחו.</w:t>
+      </w:r>
+    </w:p>
+    <w:p>
+      <w:pPr>
+        <w:bidi/>
+        <w:spacing w:after="120" w:line="360" w:lineRule="auto"/>
+        <w:jc w:val="both"/>
+      </w:pPr>
+      <w:r>
+        <w:rPr>
+          <w:rFonts w:ascii="David" w:cs="David" w:eastAsia="David" w:hAnsi="David"/>
+          <w:noProof/>
+          <w:b/>
+          <w:bCs/>
+          <w:sz w:val="24"/>
+          <w:szCs w:val="24"/>
+          <w:rtl/>
+        </w:rPr>
+        <w:t xml:space="preserve">מראיינת: </w:t>
+      </w:r>
+      <w:r>
+        <w:rPr>
+          <w:rFonts w:ascii="David" w:cs="David" w:eastAsia="David" w:hAnsi="David"/>
+          <w:noProof/>
+          <w:sz w:val="24"/>
+          <w:szCs w:val="24"/>
+          <w:rtl/>
+        </w:rPr>
+        <w:t xml:space="preserve">אילו תכונות אישה צריכה לדעתך כדי להצליח בעבודה?</w:t>
+      </w:r>
+    </w:p>
+    <w:p>
+      <w:pPr>
+        <w:bidi/>
+        <w:spacing w:after="120" w:line="360" w:lineRule="auto"/>
+        <w:jc w:val="both"/>
+      </w:pPr>
+      <w:r>
+        <w:rPr>
+          <w:rFonts w:ascii="David" w:cs="David" w:eastAsia="David" w:hAnsi="David"/>
+          <w:noProof/>
+          <w:b/>
+          <w:bCs/>
+          <w:sz w:val="24"/>
+          <w:szCs w:val="24"/>
+          <w:rtl/>
+        </w:rPr>
+        <w:t xml:space="preserve">נור: </w:t>
+      </w:r>
+      <w:r>
+        <w:rPr>
+          <w:rFonts w:ascii="David" w:cs="David" w:eastAsia="David" w:hAnsi="David"/>
+          <w:noProof/>
+          <w:sz w:val="24"/>
+          <w:szCs w:val="24"/>
+          <w:rtl/>
+        </w:rPr>
+        <w:t xml:space="preserve">היא צריכה להיות חזקה. לא משנה מה קורה בחיים, היא לא צריכה להתייאש. גם אם היא נופלת בדרך, היא צריכה לקום ולהמשיך.</w:t>
       </w:r>
     </w:p>
     <w:p>
       <w:pPr>
         <w:bidi/>
         <w:spacing w:after="60" w:before="160" w:line="360" w:lineRule="auto"/>
-        <w:jc w:val="both"/>
-      </w:pPr>
-      <w:r>
-        <w:rPr>
-          <w:rFonts w:ascii="David" w:cs="David" w:eastAsia="David" w:hAnsi="David"/>
-          <w:noProof/>
-          <w:b/>
-          <w:bCs/>
-          <w:sz w:val="24"/>
-          <w:szCs w:val="24"/>
-          <w:rtl/>
-        </w:rPr>
-        <w:t xml:space="preserve">6. מה נתן לך כוח להמשיך? מה השתנה בך מאז שהתחלת?</w:t>
-      </w:r>
-    </w:p>
-    <w:p>
-      <w:pPr>
-        <w:bidi/>
-        <w:spacing w:after="120" w:line="360" w:lineRule="auto"/>
-        <w:jc w:val="both"/>
-      </w:pPr>
-      <w:r>
-        <w:rPr>
-          <w:rFonts w:ascii="David" w:cs="David" w:eastAsia="David" w:hAnsi="David"/>
-          <w:noProof/>
-          <w:sz w:val="24"/>
-          <w:szCs w:val="24"/>
-          <w:rtl/>
-        </w:rPr>
-        <w:t xml:space="preserve">צריך סבלנות. בתקופות הקשות, כשלא הייתה עבודה וההוצאות המשיכו, אדם אומר לעצמו שהוא צריך לחכות ולתת לדבר לגדול. חייב להיות רצון מבפנים. כשאת מחליטה שאת רוצה לעשות משהו, את ממשיכה, גם כשאין לקוחות שבוע שלם. נתנה לי כוח גם אחותי, כי לא הייתי לבד, וכשאחת מאיתנו התייאשה השנייה אמרה עוד חודש. ונתנה לי כוח האמונה, שאלוהים לא ישאיר אותנו. מה שהשתנה בי הכי הרבה זה האופי. בעבר לא הייתי יכולה לסבול אפילו מילה. אם לקוחה אמרה משהו, אם בעלי אמר משהו, הייתי מתפוצצת. היום אני הרבה יותר סבלנית. למדתי להיות סבלנית ולדעת איך להתנהל עם אנשים, איך לשמוע לקוחה שכועסת ולא לכעוס בחזרה. היום אני רגועה יותר, בחנות ובבית. הדבר הכי חשוב שלמדתי הוא סבלנות. ואני רואה את עצמי כאישה חזקה מאוד, ברוך השם. עברתי והתמודדתי עם דברים שלא היו קלים, והצלחתי להתגבר עליהם בעזרת הסבלנות, הרצון והכוח, וכמובן בעזרת אלוהים.</w:t>
+        <w:jc w:val="right"/>
+      </w:pPr>
+      <w:r>
+        <w:rPr>
+          <w:rFonts w:ascii="David" w:cs="David" w:eastAsia="David" w:hAnsi="David"/>
+          <w:noProof/>
+          <w:b/>
+          <w:bCs/>
+          <w:sz w:val="24"/>
+          <w:szCs w:val="24"/>
+          <w:rtl/>
+        </w:rPr>
+        <w:t xml:space="preserve">נשים והחברה הערבית</w:t>
+      </w:r>
+    </w:p>
+    <w:p>
+      <w:pPr>
+        <w:bidi/>
+        <w:spacing w:after="120" w:line="360" w:lineRule="auto"/>
+        <w:jc w:val="both"/>
+      </w:pPr>
+      <w:r>
+        <w:rPr>
+          <w:rFonts w:ascii="David" w:cs="David" w:eastAsia="David" w:hAnsi="David"/>
+          <w:noProof/>
+          <w:b/>
+          <w:bCs/>
+          <w:sz w:val="24"/>
+          <w:szCs w:val="24"/>
+          <w:rtl/>
+        </w:rPr>
+        <w:t xml:space="preserve">מראיינת: </w:t>
+      </w:r>
+      <w:r>
+        <w:rPr>
+          <w:rFonts w:ascii="David" w:cs="David" w:eastAsia="David" w:hAnsi="David"/>
+          <w:noProof/>
+          <w:sz w:val="24"/>
+          <w:szCs w:val="24"/>
+          <w:rtl/>
+        </w:rPr>
+        <w:t xml:space="preserve">אני רוצה לשאול אותך גם על נשים בחברה הערבית. האם לדעתך מעמדן של הנשים בחברה הערבית משפיע על האפשרויות שלהן להצליח?</w:t>
+      </w:r>
+    </w:p>
+    <w:p>
+      <w:pPr>
+        <w:bidi/>
+        <w:spacing w:after="120" w:line="360" w:lineRule="auto"/>
+        <w:jc w:val="both"/>
+      </w:pPr>
+      <w:r>
+        <w:rPr>
+          <w:rFonts w:ascii="David" w:cs="David" w:eastAsia="David" w:hAnsi="David"/>
+          <w:noProof/>
+          <w:b/>
+          <w:bCs/>
+          <w:sz w:val="24"/>
+          <w:szCs w:val="24"/>
+          <w:rtl/>
+        </w:rPr>
+        <w:t xml:space="preserve">נור: </w:t>
+      </w:r>
+      <w:r>
+        <w:rPr>
+          <w:rFonts w:ascii="David" w:cs="David" w:eastAsia="David" w:hAnsi="David"/>
+          <w:noProof/>
+          <w:sz w:val="24"/>
+          <w:szCs w:val="24"/>
+          <w:rtl/>
+        </w:rPr>
+        <w:t xml:space="preserve">זה היה יותר בעבר. היום אנחנו בתקופה אחרת, ואפילו בהשוואה ללפני שלושים או ארבעים שנה הדברים השתנו. אישה שמכבדת את עצמה לא צריכה לפחד לדבר או להתנהל עם אנשים.</w:t>
+      </w:r>
+    </w:p>
+    <w:p>
+      <w:pPr>
+        <w:bidi/>
+        <w:spacing w:after="120" w:line="360" w:lineRule="auto"/>
+        <w:jc w:val="both"/>
+      </w:pPr>
+      <w:r>
+        <w:rPr>
+          <w:rFonts w:ascii="David" w:cs="David" w:eastAsia="David" w:hAnsi="David"/>
+          <w:noProof/>
+          <w:b/>
+          <w:bCs/>
+          <w:sz w:val="24"/>
+          <w:szCs w:val="24"/>
+          <w:rtl/>
+        </w:rPr>
+        <w:t xml:space="preserve">מראיינת: </w:t>
+      </w:r>
+      <w:r>
+        <w:rPr>
+          <w:rFonts w:ascii="David" w:cs="David" w:eastAsia="David" w:hAnsi="David"/>
+          <w:noProof/>
+          <w:sz w:val="24"/>
+          <w:szCs w:val="24"/>
+          <w:rtl/>
+        </w:rPr>
+        <w:t xml:space="preserve">את מרגישה שהחברה באמת השתנתה ביחס לעבודת נשים?</w:t>
+      </w:r>
+    </w:p>
+    <w:p>
+      <w:pPr>
+        <w:bidi/>
+        <w:spacing w:after="120" w:line="360" w:lineRule="auto"/>
+        <w:jc w:val="both"/>
+      </w:pPr>
+      <w:r>
+        <w:rPr>
+          <w:rFonts w:ascii="David" w:cs="David" w:eastAsia="David" w:hAnsi="David"/>
+          <w:noProof/>
+          <w:b/>
+          <w:bCs/>
+          <w:sz w:val="24"/>
+          <w:szCs w:val="24"/>
+          <w:rtl/>
+        </w:rPr>
+        <w:t xml:space="preserve">נור: </w:t>
+      </w:r>
+      <w:r>
+        <w:rPr>
+          <w:rFonts w:ascii="David" w:cs="David" w:eastAsia="David" w:hAnsi="David"/>
+          <w:noProof/>
+          <w:sz w:val="24"/>
+          <w:szCs w:val="24"/>
+          <w:rtl/>
+        </w:rPr>
+        <w:t xml:space="preserve">כן, החברה השתנתה מאוד. בעבר היה הרבה יותר קשה לאישה להצליח.</w:t>
+      </w:r>
+    </w:p>
+    <w:p>
+      <w:pPr>
+        <w:bidi/>
+        <w:spacing w:after="120" w:line="360" w:lineRule="auto"/>
+        <w:jc w:val="both"/>
+      </w:pPr>
+      <w:r>
+        <w:rPr>
+          <w:rFonts w:ascii="David" w:cs="David" w:eastAsia="David" w:hAnsi="David"/>
+          <w:noProof/>
+          <w:b/>
+          <w:bCs/>
+          <w:sz w:val="24"/>
+          <w:szCs w:val="24"/>
+          <w:rtl/>
+        </w:rPr>
+        <w:t xml:space="preserve">מראיינת: </w:t>
+      </w:r>
+      <w:r>
+        <w:rPr>
+          <w:rFonts w:ascii="David" w:cs="David" w:eastAsia="David" w:hAnsi="David"/>
+          <w:noProof/>
+          <w:sz w:val="24"/>
+          <w:szCs w:val="24"/>
+          <w:rtl/>
+        </w:rPr>
+        <w:t xml:space="preserve">מה ההבדל לדעתך בין האפשרויות של גבר להצליח לבין האפשרויות של אישה?</w:t>
+      </w:r>
+    </w:p>
+    <w:p>
+      <w:pPr>
+        <w:bidi/>
+        <w:spacing w:after="120" w:line="360" w:lineRule="auto"/>
+        <w:jc w:val="both"/>
+      </w:pPr>
+      <w:r>
+        <w:rPr>
+          <w:rFonts w:ascii="David" w:cs="David" w:eastAsia="David" w:hAnsi="David"/>
+          <w:noProof/>
+          <w:b/>
+          <w:bCs/>
+          <w:sz w:val="24"/>
+          <w:szCs w:val="24"/>
+          <w:rtl/>
+        </w:rPr>
+        <w:t xml:space="preserve">נור: </w:t>
+      </w:r>
+      <w:r>
+        <w:rPr>
+          <w:rFonts w:ascii="David" w:cs="David" w:eastAsia="David" w:hAnsi="David"/>
+          <w:noProof/>
+          <w:sz w:val="24"/>
+          <w:szCs w:val="24"/>
+          <w:rtl/>
+        </w:rPr>
+        <w:t xml:space="preserve">בעבר לאישה היה קשה יותר להצליח, כי היו דברים שהיא לא הייתה יכולה לעשות כמו גבר. למשל, גבר יכול לעבוד בלילה ואישה פחות. אבל היום המצב השתנה, והנשים מצליחות יותר ויותר.</w:t>
       </w:r>
     </w:p>
     <w:p>
       <w:pPr>
         <w:bidi/>
         <w:spacing w:after="60" w:before="160" w:line="360" w:lineRule="auto"/>
-        <w:jc w:val="both"/>
-      </w:pPr>
-      <w:r>
-        <w:rPr>
-          <w:rFonts w:ascii="David" w:cs="David" w:eastAsia="David" w:hAnsi="David"/>
-          <w:noProof/>
-          <w:b/>
-          <w:bCs/>
-          <w:sz w:val="24"/>
-          <w:szCs w:val="24"/>
-          <w:rtl/>
-        </w:rPr>
-        <w:t xml:space="preserve">7. מה זו הצלחה בשבילך?</w:t>
-      </w:r>
-    </w:p>
-    <w:p>
-      <w:pPr>
-        <w:bidi/>
-        <w:spacing w:after="120" w:line="360" w:lineRule="auto"/>
-        <w:jc w:val="both"/>
-      </w:pPr>
-      <w:r>
-        <w:rPr>
-          <w:rFonts w:ascii="David" w:cs="David" w:eastAsia="David" w:hAnsi="David"/>
-          <w:noProof/>
-          <w:sz w:val="24"/>
-          <w:szCs w:val="24"/>
-          <w:rtl/>
-        </w:rPr>
-        <w:t xml:space="preserve">הצלחה בשבילי היא רצון. צריך שיהיה לך רצון כדי להצליח. לא משנה מה קורה, אל תקשיבי לכל אחד. את צריכה להיות משוכנעת במה שאת עושה ולאהוב את מה שאת עושה כדי להצליח. אני לא מודדת הצלחה בכסף, כי היו שנים עם כסף ושנים בלי, והחנות נשארה. הצלחה בשבילי היא שהחנות פתוחה עשרים וארבע שנים, שהילדים גדלו ולא חסר להם, ושאני יודעת שעשיתי את זה בידיים שלי, יחד עם אחותי. אבל אני לא מרגישה שהגעתי לסוף. לא תמיד בן אדם מגיע למאה אחוז. אני רוצה להגיע ליותר, כמובן. בן אדם לא תמיד מסתפק במה שיש לו, זאת הטבע שלנו. הייתי רוצה להתפתח ולפתוח עוד חנויות, למשל ביישובים מסביב, סניפים נוספים, אולי עם הבנות. וכשאני רואה נשים אחרות, אני יודעת שאפשר. יש הרבה נשים שהצליחו בלי השכלה אקדמית. גם אצלנו יש נשים שפתחו עסקים ופרויקטים שונים והצליחו, ואף אחת מהן לא למדה את זה בשום מקום.</w:t>
+        <w:jc w:val="right"/>
+      </w:pPr>
+      <w:r>
+        <w:rPr>
+          <w:rFonts w:ascii="David" w:cs="David" w:eastAsia="David" w:hAnsi="David"/>
+          <w:noProof/>
+          <w:b/>
+          <w:bCs/>
+          <w:sz w:val="24"/>
+          <w:szCs w:val="24"/>
+          <w:rtl/>
+        </w:rPr>
+        <w:t xml:space="preserve">השכלה ושפה</w:t>
+      </w:r>
+    </w:p>
+    <w:p>
+      <w:pPr>
+        <w:bidi/>
+        <w:spacing w:after="120" w:line="360" w:lineRule="auto"/>
+        <w:jc w:val="both"/>
+      </w:pPr>
+      <w:r>
+        <w:rPr>
+          <w:rFonts w:ascii="David" w:cs="David" w:eastAsia="David" w:hAnsi="David"/>
+          <w:noProof/>
+          <w:b/>
+          <w:bCs/>
+          <w:sz w:val="24"/>
+          <w:szCs w:val="24"/>
+          <w:rtl/>
+        </w:rPr>
+        <w:t xml:space="preserve">מראיינת: </w:t>
+      </w:r>
+      <w:r>
+        <w:rPr>
+          <w:rFonts w:ascii="David" w:cs="David" w:eastAsia="David" w:hAnsi="David"/>
+          <w:noProof/>
+          <w:sz w:val="24"/>
+          <w:szCs w:val="24"/>
+          <w:rtl/>
+        </w:rPr>
+        <w:t xml:space="preserve">האם היו מצבים שבהם התקשת בעברית בגלל שלא היית רגילה להשתמש בשפה?</w:t>
+      </w:r>
+    </w:p>
+    <w:p>
+      <w:pPr>
+        <w:bidi/>
+        <w:spacing w:after="120" w:line="360" w:lineRule="auto"/>
+        <w:jc w:val="both"/>
+      </w:pPr>
+      <w:r>
+        <w:rPr>
+          <w:rFonts w:ascii="David" w:cs="David" w:eastAsia="David" w:hAnsi="David"/>
+          <w:noProof/>
+          <w:b/>
+          <w:bCs/>
+          <w:sz w:val="24"/>
+          <w:szCs w:val="24"/>
+          <w:rtl/>
+        </w:rPr>
+        <w:t xml:space="preserve">נור: </w:t>
+      </w:r>
+      <w:r>
+        <w:rPr>
+          <w:rFonts w:ascii="David" w:cs="David" w:eastAsia="David" w:hAnsi="David"/>
+          <w:noProof/>
+          <w:sz w:val="24"/>
+          <w:szCs w:val="24"/>
+          <w:rtl/>
+        </w:rPr>
+        <w:t xml:space="preserve">כן. בהתחלה היה לי קשה מאוד. כשהייתי צעירה כמעט לא ידעתי עברית, אבל עם הזמן למדתי להסתדר.</w:t>
+      </w:r>
+    </w:p>
+    <w:p>
+      <w:pPr>
+        <w:bidi/>
+        <w:spacing w:after="120" w:line="360" w:lineRule="auto"/>
+        <w:jc w:val="both"/>
+      </w:pPr>
+      <w:r>
+        <w:rPr>
+          <w:rFonts w:ascii="David" w:cs="David" w:eastAsia="David" w:hAnsi="David"/>
+          <w:noProof/>
+          <w:b/>
+          <w:bCs/>
+          <w:sz w:val="24"/>
+          <w:szCs w:val="24"/>
+          <w:rtl/>
+        </w:rPr>
+        <w:t xml:space="preserve">מראיינת: </w:t>
+      </w:r>
+      <w:r>
+        <w:rPr>
+          <w:rFonts w:ascii="David" w:cs="David" w:eastAsia="David" w:hAnsi="David"/>
+          <w:noProof/>
+          <w:sz w:val="24"/>
+          <w:szCs w:val="24"/>
+          <w:rtl/>
+        </w:rPr>
+        <w:t xml:space="preserve">כלומר, גם את הקושי בשפה למדת להתמודד איתו עם הזמן?</w:t>
+      </w:r>
+    </w:p>
+    <w:p>
+      <w:pPr>
+        <w:bidi/>
+        <w:spacing w:after="120" w:line="360" w:lineRule="auto"/>
+        <w:jc w:val="both"/>
+      </w:pPr>
+      <w:r>
+        <w:rPr>
+          <w:rFonts w:ascii="David" w:cs="David" w:eastAsia="David" w:hAnsi="David"/>
+          <w:noProof/>
+          <w:b/>
+          <w:bCs/>
+          <w:sz w:val="24"/>
+          <w:szCs w:val="24"/>
+          <w:rtl/>
+        </w:rPr>
+        <w:t xml:space="preserve">נור: </w:t>
+      </w:r>
+      <w:r>
+        <w:rPr>
+          <w:rFonts w:ascii="David" w:cs="David" w:eastAsia="David" w:hAnsi="David"/>
+          <w:noProof/>
+          <w:sz w:val="24"/>
+          <w:szCs w:val="24"/>
+          <w:rtl/>
+        </w:rPr>
+        <w:t xml:space="preserve">כן. בהתחלה היה לי קשה מאוד, אבל עם הזמן למדתי להסתדר.</w:t>
+      </w:r>
+    </w:p>
+    <w:p>
+      <w:pPr>
+        <w:bidi/>
+        <w:spacing w:after="120" w:line="360" w:lineRule="auto"/>
+        <w:jc w:val="both"/>
+      </w:pPr>
+      <w:r>
+        <w:rPr>
+          <w:rFonts w:ascii="David" w:cs="David" w:eastAsia="David" w:hAnsi="David"/>
+          <w:noProof/>
+          <w:b/>
+          <w:bCs/>
+          <w:sz w:val="24"/>
+          <w:szCs w:val="24"/>
+          <w:rtl/>
+        </w:rPr>
+        <w:t xml:space="preserve">מראיינת: </w:t>
+      </w:r>
+      <w:r>
+        <w:rPr>
+          <w:rFonts w:ascii="David" w:cs="David" w:eastAsia="David" w:hAnsi="David"/>
+          <w:noProof/>
+          <w:sz w:val="24"/>
+          <w:szCs w:val="24"/>
+          <w:rtl/>
+        </w:rPr>
+        <w:t xml:space="preserve">העובדה שלא המשכת ללמוד הייתה בגלל המשפחה?</w:t>
+      </w:r>
+    </w:p>
+    <w:p>
+      <w:pPr>
+        <w:bidi/>
+        <w:spacing w:after="120" w:line="360" w:lineRule="auto"/>
+        <w:jc w:val="both"/>
+      </w:pPr>
+      <w:r>
+        <w:rPr>
+          <w:rFonts w:ascii="David" w:cs="David" w:eastAsia="David" w:hAnsi="David"/>
+          <w:noProof/>
+          <w:b/>
+          <w:bCs/>
+          <w:sz w:val="24"/>
+          <w:szCs w:val="24"/>
+          <w:rtl/>
+        </w:rPr>
+        <w:t xml:space="preserve">נור: </w:t>
+      </w:r>
+      <w:r>
+        <w:rPr>
+          <w:rFonts w:ascii="David" w:cs="David" w:eastAsia="David" w:hAnsi="David"/>
+          <w:noProof/>
+          <w:sz w:val="24"/>
+          <w:szCs w:val="24"/>
+          <w:rtl/>
+        </w:rPr>
+        <w:t xml:space="preserve">לא בגלל המשפחה. בזמננו הדברים היו שונים. לא היו האפשרויות שיש היום. פעם מסיימים בית ספר וזהו, לא היה כמו היום.</w:t>
+      </w:r>
+    </w:p>
+    <w:p>
+      <w:pPr>
+        <w:bidi/>
+        <w:spacing w:after="120" w:line="360" w:lineRule="auto"/>
+        <w:jc w:val="both"/>
+      </w:pPr>
+      <w:r>
+        <w:rPr>
+          <w:rFonts w:ascii="David" w:cs="David" w:eastAsia="David" w:hAnsi="David"/>
+          <w:noProof/>
+          <w:b/>
+          <w:bCs/>
+          <w:sz w:val="24"/>
+          <w:szCs w:val="24"/>
+          <w:rtl/>
+        </w:rPr>
+        <w:t xml:space="preserve">מראיינת: </w:t>
+      </w:r>
+      <w:r>
+        <w:rPr>
+          <w:rFonts w:ascii="David" w:cs="David" w:eastAsia="David" w:hAnsi="David"/>
+          <w:noProof/>
+          <w:sz w:val="24"/>
+          <w:szCs w:val="24"/>
+          <w:rtl/>
+        </w:rPr>
+        <w:t xml:space="preserve">כלומר, את מרגישה שהאפשרויות שיש לנשים היום שונות מאלה שהיו לנשים בדור שלך?</w:t>
+      </w:r>
+    </w:p>
+    <w:p>
+      <w:pPr>
+        <w:bidi/>
+        <w:spacing w:after="120" w:line="360" w:lineRule="auto"/>
+        <w:jc w:val="both"/>
+      </w:pPr>
+      <w:r>
+        <w:rPr>
+          <w:rFonts w:ascii="David" w:cs="David" w:eastAsia="David" w:hAnsi="David"/>
+          <w:noProof/>
+          <w:b/>
+          <w:bCs/>
+          <w:sz w:val="24"/>
+          <w:szCs w:val="24"/>
+          <w:rtl/>
+        </w:rPr>
+        <w:t xml:space="preserve">נור: </w:t>
+      </w:r>
+      <w:r>
+        <w:rPr>
+          <w:rFonts w:ascii="David" w:cs="David" w:eastAsia="David" w:hAnsi="David"/>
+          <w:noProof/>
+          <w:sz w:val="24"/>
+          <w:szCs w:val="24"/>
+          <w:rtl/>
+        </w:rPr>
+        <w:t xml:space="preserve">כמובן. היום הדברים שונים מאוד, וגם יש יותר חשיבות לתעודה ולהשכלה.</w:t>
       </w:r>
     </w:p>
     <w:p>
       <w:pPr>
         <w:bidi/>
         <w:spacing w:after="60" w:before="160" w:line="360" w:lineRule="auto"/>
-        <w:jc w:val="both"/>
-      </w:pPr>
-      <w:r>
-        <w:rPr>
-          <w:rFonts w:ascii="David" w:cs="David" w:eastAsia="David" w:hAnsi="David"/>
-          <w:noProof/>
-          <w:b/>
-          <w:bCs/>
-          <w:sz w:val="24"/>
-          <w:szCs w:val="24"/>
-          <w:rtl/>
-        </w:rPr>
-        <w:t xml:space="preserve">8. מה השתנה לדעתך במצב של נשים ערביות לעומת העבר?</w:t>
-      </w:r>
-    </w:p>
-    <w:p>
-      <w:pPr>
-        <w:bidi/>
-        <w:spacing w:after="120" w:line="360" w:lineRule="auto"/>
-        <w:jc w:val="both"/>
-      </w:pPr>
-      <w:r>
-        <w:rPr>
-          <w:rFonts w:ascii="David" w:cs="David" w:eastAsia="David" w:hAnsi="David"/>
-          <w:noProof/>
-          <w:sz w:val="24"/>
-          <w:szCs w:val="24"/>
-          <w:rtl/>
-        </w:rPr>
-        <w:t xml:space="preserve">זה היה יותר בעבר. היום אנחנו בתקופה אחרת, ואפילו בהשוואה ללפני שלושים או ארבעים שנה הדברים השתנו. החברה השתנתה מאוד. בעבר היה הרבה יותר קשה לאישה להצליח, כי היו דברים שהיא לא הייתה יכולה לעשות כמו גבר. גבר יכול לעבוד בלילה, לנסוע לבד, לפתוח עסק ואף אחד לא שואל. אישה פחות. כשאני פתחתי, אישה שעומדת בחנות כל היום הייתה משהו שמדברים עליו. היום הנשים מצליחות יותר ויותר, ובכל רחוב אצלנו יש אישה עם עסק. אישה שמכבדת את עצמה לא צריכה לפחד לדבר או להתנהל עם אנשים, וזה מה שהבנות של היום כבר יודעות. מה שעוד השתנה זה הלימודים. בזמננו סיימו בית ספר וזהו, והיום הדברים שונים מאוד, ויש יותר חשיבות לתעודה ולהשכלה. הבנות היום לומדות, ובצדק, כי העולם שאני פתחתי בו, בלי רשתות ובלי תעודות, כבר לא קיים. אבל אני חושבת שגם היום, עם כל השינוי, אישה שרוצה צריכה את אותו הדבר שאני הייתי צריכה: רצון, סבלנות, ומשפחה שעומדת לידה.</w:t>
-      </w:r>
-    </w:p>
-    <w:p>
-      <w:pPr>
-        <w:bidi/>
-        <w:spacing w:after="60" w:before="160" w:line="360" w:lineRule="auto"/>
-        <w:jc w:val="both"/>
-      </w:pPr>
-      <w:r>
-        <w:rPr>
-          <w:rFonts w:ascii="David" w:cs="David" w:eastAsia="David" w:hAnsi="David"/>
-          <w:noProof/>
-          <w:b/>
-          <w:bCs/>
-          <w:sz w:val="24"/>
-          <w:szCs w:val="24"/>
-          <w:rtl/>
-        </w:rPr>
-        <w:t xml:space="preserve">9. איזו עצה היית נותנת לאישה צעירה?</w:t>
-      </w:r>
-    </w:p>
-    <w:p>
-      <w:pPr>
-        <w:bidi/>
-        <w:spacing w:after="120" w:line="360" w:lineRule="auto"/>
-        <w:jc w:val="both"/>
-      </w:pPr>
-      <w:r>
-        <w:rPr>
-          <w:rFonts w:ascii="David" w:cs="David" w:eastAsia="David" w:hAnsi="David"/>
-          <w:noProof/>
-          <w:sz w:val="24"/>
-          <w:szCs w:val="24"/>
-          <w:rtl/>
-        </w:rPr>
-        <w:t xml:space="preserve">הייתי אומרת לה שלא תחכה. שתתחיל לעבוד ולא תחכה לאף אחד, לא לבעל, לא להורים, לא לזמן המתאים, כי הזמן המתאים לא מגיע. שלא תיתן למילים של אחרים להוריד לה את המוטיבציה. תמיד יהיה מי שידבר, בהתחלה יותר, אחר כך פחות, וכשיש הצלחה הם שותקים. בהתחלה זה יכול להיות קשה, אבל אחר כך העסק יכול לגדול ולהצליח, בעזרת השם. והייתי אומרת לה שמי שרוצה להקים עסק צריכה להיות סבלנית, במיוחד במסחר. במסחר יש חודשים טובים וחודשים ריקים, וצריך לדעת לקבל הפסד כמו שמקבלים רווח. מי שלא יכולה לסבול הפסד, שלא תפתח. צריך סבלנות וכוח להמשיך. והייתי אומרת לה להיות חזקה. לא משנה מה קורה בחיים, היא לא צריכה להתייאש. גם אם היא נופלת בדרך, היא צריכה לקום ולהמשיך. ועוד דבר אחד, מהניסיון שלי: אם יש לה מישהי לעבוד איתה, אחות, חברה, שתיקח אותה. לבד זה אפשרי, אבל ביחד זה קל יותר, ובימים הקשים צריך מישהי שתגיד לך עוד חודש.</w:t>
-      </w:r>
-    </w:p>
-    <w:p>
-      <w:pPr>
-        <w:bidi/>
-        <w:spacing w:after="60" w:before="160" w:line="360" w:lineRule="auto"/>
-        <w:jc w:val="both"/>
-      </w:pPr>
-      <w:r>
-        <w:rPr>
-          <w:rFonts w:ascii="David" w:cs="David" w:eastAsia="David" w:hAnsi="David"/>
-          <w:noProof/>
-          <w:b/>
-          <w:bCs/>
-          <w:sz w:val="24"/>
-          <w:szCs w:val="24"/>
-          <w:rtl/>
-        </w:rPr>
-        <w:t xml:space="preserve">10. האם את מסכימה שהריאיון ישמש לעבודה סמינריונית בשם בדוי?</w:t>
-      </w:r>
-    </w:p>
-    <w:p>
-      <w:pPr>
-        <w:bidi/>
-        <w:spacing w:after="120" w:line="360" w:lineRule="auto"/>
-        <w:jc w:val="both"/>
-      </w:pPr>
-      <w:r>
-        <w:rPr>
-          <w:rFonts w:ascii="David" w:cs="David" w:eastAsia="David" w:hAnsi="David"/>
-          <w:noProof/>
-          <w:sz w:val="24"/>
-          <w:szCs w:val="24"/>
-          <w:rtl/>
-        </w:rPr>
-        <w:t xml:space="preserve">כן, כמובן שאני מסכימה. אין לי בעיה שהדברים שלי יהיו בעבודה ויוצגו בפני המרצים, ובשם בדוי זה אפילו עדיף, כי אצלנו כולם מכירים את החנות ואני לא רוצה שיזהו לקוחה או שידברו על בעלי. אני מסכימה כי אני חושבת שהסיפור הזה יכול לעזור. כשאני ואחותי התחלנו לא היה לנו ממי ללמוד ולא היה ממי לשמוע איך זה עובד, הכול עשינו לבד, בטעויות. אם בת צעירה תקרא את זה ותבין שאפשר להתחיל בלי הרבה ולהצליח עם סבלנות, זה שווה. רק דבר אחד אני מבקשת: שתכתבי גם את הקושי, לא רק את ההצלחה. את השנה הראשונה, את החישובים, את התקופה עם בעלי. כי אם כותבים רק את הסוף הטוב, אף אחת לא תאמין, ואם כותבים את הדרך, מישהי תגיד "גם אני יכולה". ואם תרצי לשאול עוד, תבואי לחנות, אחותי פה בימי שלישי, ותשמעי גם אותה. ברוך השם על הכול.</w:t>
+        <w:jc w:val="right"/>
+      </w:pPr>
+      <w:r>
+        <w:rPr>
+          <w:rFonts w:ascii="David" w:cs="David" w:eastAsia="David" w:hAnsi="David"/>
+          <w:noProof/>
+          <w:b/>
+          <w:bCs/>
+          <w:sz w:val="24"/>
+          <w:szCs w:val="24"/>
+          <w:rtl/>
+        </w:rPr>
+        <w:t xml:space="preserve">העתיד והמלצות לנשים</w:t>
+      </w:r>
+    </w:p>
+    <w:p>
+      <w:pPr>
+        <w:bidi/>
+        <w:spacing w:after="120" w:line="360" w:lineRule="auto"/>
+        <w:jc w:val="both"/>
+      </w:pPr>
+      <w:r>
+        <w:rPr>
+          <w:rFonts w:ascii="David" w:cs="David" w:eastAsia="David" w:hAnsi="David"/>
+          <w:noProof/>
+          <w:b/>
+          <w:bCs/>
+          <w:sz w:val="24"/>
+          <w:szCs w:val="24"/>
+          <w:rtl/>
+        </w:rPr>
+        <w:t xml:space="preserve">מראיינת: </w:t>
+      </w:r>
+      <w:r>
+        <w:rPr>
+          <w:rFonts w:ascii="David" w:cs="David" w:eastAsia="David" w:hAnsi="David"/>
+          <w:noProof/>
+          <w:sz w:val="24"/>
+          <w:szCs w:val="24"/>
+          <w:rtl/>
+        </w:rPr>
+        <w:t xml:space="preserve">אחרי כל השנים שבהן ניהלת את העסק וצברת ניסיון, מה התוכניות שלך לעתיד?</w:t>
+      </w:r>
+    </w:p>
+    <w:p>
+      <w:pPr>
+        <w:bidi/>
+        <w:spacing w:after="120" w:line="360" w:lineRule="auto"/>
+        <w:jc w:val="both"/>
+      </w:pPr>
+      <w:r>
+        <w:rPr>
+          <w:rFonts w:ascii="David" w:cs="David" w:eastAsia="David" w:hAnsi="David"/>
+          <w:noProof/>
+          <w:b/>
+          <w:bCs/>
+          <w:sz w:val="24"/>
+          <w:szCs w:val="24"/>
+          <w:rtl/>
+        </w:rPr>
+        <w:t xml:space="preserve">נור: </w:t>
+      </w:r>
+      <w:r>
+        <w:rPr>
+          <w:rFonts w:ascii="David" w:cs="David" w:eastAsia="David" w:hAnsi="David"/>
+          <w:noProof/>
+          <w:sz w:val="24"/>
+          <w:szCs w:val="24"/>
+          <w:rtl/>
+        </w:rPr>
+        <w:t xml:space="preserve">הייתי רוצה להתפתח ולפתוח עוד חנויות, למשל ביישובים מסביב. הייתי רוצה לפתוח סניפים נוספים.</w:t>
+      </w:r>
+    </w:p>
+    <w:p>
+      <w:pPr>
+        <w:bidi/>
+        <w:spacing w:after="120" w:line="360" w:lineRule="auto"/>
+        <w:jc w:val="both"/>
+      </w:pPr>
+      <w:r>
+        <w:rPr>
+          <w:rFonts w:ascii="David" w:cs="David" w:eastAsia="David" w:hAnsi="David"/>
+          <w:noProof/>
+          <w:b/>
+          <w:bCs/>
+          <w:sz w:val="24"/>
+          <w:szCs w:val="24"/>
+          <w:rtl/>
+        </w:rPr>
+        <w:t xml:space="preserve">מראיינת: </w:t>
+      </w:r>
+      <w:r>
+        <w:rPr>
+          <w:rFonts w:ascii="David" w:cs="David" w:eastAsia="David" w:hAnsi="David"/>
+          <w:noProof/>
+          <w:sz w:val="24"/>
+          <w:szCs w:val="24"/>
+          <w:rtl/>
+        </w:rPr>
+        <w:t xml:space="preserve">ואם לא היית פותחת את העסק הזה, באיזה תחום היית רוצה לעסוק?</w:t>
+      </w:r>
+    </w:p>
+    <w:p>
+      <w:pPr>
+        <w:bidi/>
+        <w:spacing w:after="120" w:line="360" w:lineRule="auto"/>
+        <w:jc w:val="both"/>
+      </w:pPr>
+      <w:r>
+        <w:rPr>
+          <w:rFonts w:ascii="David" w:cs="David" w:eastAsia="David" w:hAnsi="David"/>
+          <w:noProof/>
+          <w:b/>
+          <w:bCs/>
+          <w:sz w:val="24"/>
+          <w:szCs w:val="24"/>
+          <w:rtl/>
+        </w:rPr>
+        <w:t xml:space="preserve">נור: </w:t>
+      </w:r>
+      <w:r>
+        <w:rPr>
+          <w:rFonts w:ascii="David" w:cs="David" w:eastAsia="David" w:hAnsi="David"/>
+          <w:noProof/>
+          <w:sz w:val="24"/>
+          <w:szCs w:val="24"/>
+          <w:rtl/>
+        </w:rPr>
+        <w:t xml:space="preserve">בכל דבר שקשור למסחר. אהבתי את תחום המסחר והרגשתי שהוא מתאים לי.</w:t>
+      </w:r>
+    </w:p>
+    <w:p>
+      <w:pPr>
+        <w:bidi/>
+        <w:spacing w:after="120" w:line="360" w:lineRule="auto"/>
+        <w:jc w:val="both"/>
+      </w:pPr>
+      <w:r>
+        <w:rPr>
+          <w:rFonts w:ascii="David" w:cs="David" w:eastAsia="David" w:hAnsi="David"/>
+          <w:noProof/>
+          <w:b/>
+          <w:bCs/>
+          <w:sz w:val="24"/>
+          <w:szCs w:val="24"/>
+          <w:rtl/>
+        </w:rPr>
+        <w:t xml:space="preserve">מראיינת: </w:t>
+      </w:r>
+      <w:r>
+        <w:rPr>
+          <w:rFonts w:ascii="David" w:cs="David" w:eastAsia="David" w:hAnsi="David"/>
+          <w:noProof/>
+          <w:sz w:val="24"/>
+          <w:szCs w:val="24"/>
+          <w:rtl/>
+        </w:rPr>
+        <w:t xml:space="preserve">מתוך כל הניסיון שצברת, איזו עצה היית נותנת היום לאישה שרוצה לפתוח עסק משלה?</w:t>
+      </w:r>
+    </w:p>
+    <w:p>
+      <w:pPr>
+        <w:bidi/>
+        <w:spacing w:after="120" w:line="360" w:lineRule="auto"/>
+        <w:jc w:val="both"/>
+      </w:pPr>
+      <w:r>
+        <w:rPr>
+          <w:rFonts w:ascii="David" w:cs="David" w:eastAsia="David" w:hAnsi="David"/>
+          <w:noProof/>
+          <w:b/>
+          <w:bCs/>
+          <w:sz w:val="24"/>
+          <w:szCs w:val="24"/>
+          <w:rtl/>
+        </w:rPr>
+        <w:t xml:space="preserve">נור: </w:t>
+      </w:r>
+      <w:r>
+        <w:rPr>
+          <w:rFonts w:ascii="David" w:cs="David" w:eastAsia="David" w:hAnsi="David"/>
+          <w:noProof/>
+          <w:sz w:val="24"/>
+          <w:szCs w:val="24"/>
+          <w:rtl/>
+        </w:rPr>
+        <w:t xml:space="preserve">שלא תחכה. שתתחיל לעבוד ולא תחכה לאף אחד. שלא תיתן למילים של אחרים להוריד לה את המוטיבציה. בהתחלה זה יכול להיות קשה, אבל אחר כך העסק יכול לגדול ולהצליח, בעזרת השם.</w:t>
+      </w:r>
+    </w:p>
+    <w:p>
+      <w:pPr>
+        <w:bidi/>
+        <w:spacing w:after="120" w:line="360" w:lineRule="auto"/>
+        <w:jc w:val="both"/>
+      </w:pPr>
+      <w:r>
+        <w:rPr>
+          <w:rFonts w:ascii="David" w:cs="David" w:eastAsia="David" w:hAnsi="David"/>
+          <w:noProof/>
+          <w:b/>
+          <w:bCs/>
+          <w:sz w:val="24"/>
+          <w:szCs w:val="24"/>
+          <w:rtl/>
+        </w:rPr>
+        <w:t xml:space="preserve">מראיינת: </w:t>
+      </w:r>
+      <w:r>
+        <w:rPr>
+          <w:rFonts w:ascii="David" w:cs="David" w:eastAsia="David" w:hAnsi="David"/>
+          <w:noProof/>
+          <w:sz w:val="24"/>
+          <w:szCs w:val="24"/>
+          <w:rtl/>
+        </w:rPr>
+        <w:t xml:space="preserve">ומה המסר האחרון שהיית רוצה להעביר לנשים שרוצות להתחיל את הדרך שלהן?</w:t>
+      </w:r>
+    </w:p>
+    <w:p>
+      <w:pPr>
+        <w:bidi/>
+        <w:spacing w:after="120" w:line="360" w:lineRule="auto"/>
+        <w:jc w:val="both"/>
+      </w:pPr>
+      <w:r>
+        <w:rPr>
+          <w:rFonts w:ascii="David" w:cs="David" w:eastAsia="David" w:hAnsi="David"/>
+          <w:noProof/>
+          <w:b/>
+          <w:bCs/>
+          <w:sz w:val="24"/>
+          <w:szCs w:val="24"/>
+          <w:rtl/>
+        </w:rPr>
+        <w:t xml:space="preserve">נור: </w:t>
+      </w:r>
+      <w:r>
+        <w:rPr>
+          <w:rFonts w:ascii="David" w:cs="David" w:eastAsia="David" w:hAnsi="David"/>
+          <w:noProof/>
+          <w:sz w:val="24"/>
+          <w:szCs w:val="24"/>
+          <w:rtl/>
+        </w:rPr>
+        <w:t xml:space="preserve">מי שרוצה להקים עסק צריכה להיות סבלנית, במיוחד במסחר. צריך לדעת לקבל הפסד כמו שמקבלים רווח. צריך סבלנות וכוח להמשיך.</w:t>
+      </w:r>
+    </w:p>
+    <w:p>
+      <w:pPr>
+        <w:bidi/>
+        <w:spacing w:after="120" w:line="360" w:lineRule="auto"/>
+        <w:jc w:val="both"/>
+      </w:pPr>
+      <w:r>
+        <w:rPr>
+          <w:rFonts w:ascii="David" w:cs="David" w:eastAsia="David" w:hAnsi="David"/>
+          <w:noProof/>
+          <w:b/>
+          <w:bCs/>
+          <w:sz w:val="24"/>
+          <w:szCs w:val="24"/>
+          <w:rtl/>
+        </w:rPr>
+        <w:t xml:space="preserve">מראיינת: </w:t>
+      </w:r>
+      <w:r>
+        <w:rPr>
+          <w:rFonts w:ascii="David" w:cs="David" w:eastAsia="David" w:hAnsi="David"/>
+          <w:noProof/>
+          <w:sz w:val="24"/>
+          <w:szCs w:val="24"/>
+          <w:rtl/>
+        </w:rPr>
+        <w:t xml:space="preserve">האם את מסכימה שההקלטה והראיון ישמשו לצורך עבודת הגמר ויוצגו במסגרת האקדמית?</w:t>
+      </w:r>
+    </w:p>
+    <w:p>
+      <w:pPr>
+        <w:bidi/>
+        <w:spacing w:after="120" w:line="360" w:lineRule="auto"/>
+        <w:jc w:val="both"/>
+      </w:pPr>
+      <w:r>
+        <w:rPr>
+          <w:rFonts w:ascii="David" w:cs="David" w:eastAsia="David" w:hAnsi="David"/>
+          <w:noProof/>
+          <w:b/>
+          <w:bCs/>
+          <w:sz w:val="24"/>
+          <w:szCs w:val="24"/>
+          <w:rtl/>
+        </w:rPr>
+        <w:t xml:space="preserve">נור: </w:t>
+      </w:r>
+      <w:r>
+        <w:rPr>
+          <w:rFonts w:ascii="David" w:cs="David" w:eastAsia="David" w:hAnsi="David"/>
+          <w:noProof/>
+          <w:sz w:val="24"/>
+          <w:szCs w:val="24"/>
+          <w:rtl/>
+        </w:rPr>
+        <w:t xml:space="preserve">כן, כמובן שאני מסכימה.</w:t>
+      </w:r>
+    </w:p>
+    <w:p>
+      <w:pPr>
+        <w:bidi/>
+        <w:spacing w:after="120" w:line="360" w:lineRule="auto"/>
+        <w:jc w:val="both"/>
+      </w:pPr>
+      <w:r>
+        <w:rPr>
+          <w:rFonts w:ascii="David" w:cs="David" w:eastAsia="David" w:hAnsi="David"/>
+          <w:noProof/>
+          <w:b/>
+          <w:bCs/>
+          <w:sz w:val="24"/>
+          <w:szCs w:val="24"/>
+          <w:rtl/>
+        </w:rPr>
+        <w:t xml:space="preserve">מראיינת: </w:t>
+      </w:r>
+      <w:r>
+        <w:rPr>
+          <w:rFonts w:ascii="David" w:cs="David" w:eastAsia="David" w:hAnsi="David"/>
+          <w:noProof/>
+          <w:sz w:val="24"/>
+          <w:szCs w:val="24"/>
+          <w:rtl/>
+        </w:rPr>
+        <w:t xml:space="preserve">תודה רבה לך.</w:t>
       </w:r>
     </w:p>
     <w:p>

</xml_diff>